<commit_message>
feat: add administrator staff management
</commit_message>
<xml_diff>
--- a/SAD/Software_Architecture_and_Design_Specification_VSMMS (2).docx
+++ b/SAD/Software_Architecture_and_Design_Specification_VSMMS (2).docx
@@ -261,13 +261,7 @@
               <w:rPr>
                 <w:sz w:val="18"/>
               </w:rPr>
-              <w:t>1.0</w:t>
-            </w:r>
-            <w:r>
-              <w:rPr>
-                <w:sz w:val="20"/>
-              </w:rPr>
-              <w:t xml:space="preserve"> </w:t>
+              <w:t>1.4</w:t>
             </w:r>
           </w:p>
         </w:tc>
@@ -377,13 +371,7 @@
               <w:rPr>
                 <w:sz w:val="18"/>
               </w:rPr>
-              <w:t>06-Oct-2026</w:t>
-            </w:r>
-            <w:r>
-              <w:rPr>
-                <w:sz w:val="20"/>
-              </w:rPr>
-              <w:t xml:space="preserve"> </w:t>
+              <w:t>31-Oct-2026</w:t>
             </w:r>
           </w:p>
         </w:tc>
@@ -995,10 +983,7 @@
               </w:rPr>
             </w:pPr>
             <w:r>
-              <w:t>28</w:t>
-            </w:r>
-            <w:r>
-              <w:t>-Oct-2026</w:t>
+              <w:t>28-Oct-2026</w:t>
             </w:r>
             <w:r>
               <w:rPr>
@@ -1072,6 +1057,214 @@
                 <w:sz w:val="17"/>
               </w:rPr>
               <w:t>1.2</w:t>
+            </w:r>
+          </w:p>
+        </w:tc>
+      </w:tr>
+      <w:tr>
+        <w:trPr>
+          <w:trHeight w:val="425"/>
+        </w:trPr>
+        <w:tc>
+          <w:tcPr>
+            <w:tcW w:w="2484" w:type="dxa"/>
+            <w:tcBorders>
+              <w:top w:val="single" w:sz="4" w:space="0" w:color="000000"/>
+              <w:left w:val="single" w:sz="4" w:space="0" w:color="000000"/>
+              <w:bottom w:val="single" w:sz="4" w:space="0" w:color="000000"/>
+              <w:right w:val="single" w:sz="4" w:space="0" w:color="000000"/>
+            </w:tcBorders>
+            <w:vAlign w:val="center"/>
+          </w:tcPr>
+          <w:p>
+            <w:pPr>
+              <w:rPr>
+                <w:sz w:val="17"/>
+              </w:rPr>
+            </w:pPr>
+            <w:r>
+              <w:rPr>
+                <w:sz w:val="17"/>
+              </w:rPr>
+              <w:t>Project Team</w:t>
+            </w:r>
+          </w:p>
+        </w:tc>
+        <w:tc>
+          <w:tcPr>
+            <w:tcW w:w="2484" w:type="dxa"/>
+            <w:tcBorders>
+              <w:top w:val="single" w:sz="4" w:space="0" w:color="000000"/>
+              <w:left w:val="single" w:sz="4" w:space="0" w:color="000000"/>
+              <w:bottom w:val="single" w:sz="4" w:space="0" w:color="000000"/>
+              <w:right w:val="single" w:sz="4" w:space="0" w:color="000000"/>
+            </w:tcBorders>
+            <w:vAlign w:val="center"/>
+          </w:tcPr>
+          <w:p>
+            <w:pPr>
+              <w:ind w:left="15"/>
+              <w:rPr>
+                <w:rFonts w:ascii="Times New Roman" w:eastAsia="Times New Roman" w:hAnsi="Times New Roman" w:cs="Times New Roman"/>
+              </w:rPr>
+            </w:pPr>
+            <w:r>
+              <w:t>31-Oct-2026</w:t>
+            </w:r>
+          </w:p>
+        </w:tc>
+        <w:tc>
+          <w:tcPr>
+            <w:tcW w:w="2485" w:type="dxa"/>
+            <w:tcBorders>
+              <w:top w:val="single" w:sz="4" w:space="0" w:color="000000"/>
+              <w:left w:val="single" w:sz="4" w:space="0" w:color="000000"/>
+              <w:bottom w:val="single" w:sz="4" w:space="0" w:color="000000"/>
+              <w:right w:val="single" w:sz="4" w:space="0" w:color="000000"/>
+            </w:tcBorders>
+          </w:tcPr>
+          <w:p>
+            <w:pPr>
+              <w:ind w:left="1"/>
+              <w:rPr>
+                <w:sz w:val="17"/>
+              </w:rPr>
+            </w:pPr>
+            <w:r>
+              <w:rPr>
+                <w:sz w:val="17"/>
+              </w:rPr>
+              <w:t>Document customer self-registration, profile linking, protected staff-role administration and authentication API behavior</w:t>
+            </w:r>
+          </w:p>
+        </w:tc>
+        <w:tc>
+          <w:tcPr>
+            <w:tcW w:w="2483" w:type="dxa"/>
+            <w:tcBorders>
+              <w:top w:val="single" w:sz="4" w:space="0" w:color="000000"/>
+              <w:left w:val="single" w:sz="4" w:space="0" w:color="000000"/>
+              <w:bottom w:val="single" w:sz="4" w:space="0" w:color="000000"/>
+              <w:right w:val="single" w:sz="4" w:space="0" w:color="000000"/>
+            </w:tcBorders>
+            <w:vAlign w:val="center"/>
+          </w:tcPr>
+          <w:p>
+            <w:pPr>
+              <w:ind w:left="1"/>
+              <w:rPr>
+                <w:sz w:val="17"/>
+              </w:rPr>
+            </w:pPr>
+            <w:r>
+              <w:rPr>
+                <w:sz w:val="17"/>
+              </w:rPr>
+              <w:t>1.3</w:t>
+            </w:r>
+          </w:p>
+        </w:tc>
+      </w:tr>
+      <w:tr>
+        <w:trPr>
+          <w:trHeight w:val="425"/>
+        </w:trPr>
+        <w:tc>
+          <w:tcPr>
+            <w:tcW w:w="2484" w:type="dxa"/>
+            <w:tcBorders>
+              <w:top w:val="single" w:sz="4" w:space="0" w:color="000000"/>
+              <w:left w:val="single" w:sz="4" w:space="0" w:color="000000"/>
+              <w:bottom w:val="single" w:sz="4" w:space="0" w:color="000000"/>
+              <w:right w:val="single" w:sz="4" w:space="0" w:color="000000"/>
+            </w:tcBorders>
+            <w:vAlign w:val="center"/>
+          </w:tcPr>
+          <w:p>
+            <w:pPr>
+              <w:rPr>
+                <w:sz w:val="17"/>
+              </w:rPr>
+            </w:pPr>
+            <w:r>
+              <w:rPr>
+                <w:sz w:val="17"/>
+              </w:rPr>
+              <w:t>Project Team</w:t>
+            </w:r>
+          </w:p>
+        </w:tc>
+        <w:tc>
+          <w:tcPr>
+            <w:tcW w:w="2484" w:type="dxa"/>
+            <w:tcBorders>
+              <w:top w:val="single" w:sz="4" w:space="0" w:color="000000"/>
+              <w:left w:val="single" w:sz="4" w:space="0" w:color="000000"/>
+              <w:bottom w:val="single" w:sz="4" w:space="0" w:color="000000"/>
+              <w:right w:val="single" w:sz="4" w:space="0" w:color="000000"/>
+            </w:tcBorders>
+            <w:vAlign w:val="center"/>
+          </w:tcPr>
+          <w:p>
+            <w:pPr>
+              <w:ind w:left="15"/>
+              <w:rPr>
+                <w:rFonts w:ascii="Times New Roman" w:eastAsia="Times New Roman" w:hAnsi="Times New Roman" w:cs="Times New Roman"/>
+              </w:rPr>
+            </w:pPr>
+            <w:r>
+              <w:t>31-Oct-2026</w:t>
+            </w:r>
+          </w:p>
+        </w:tc>
+        <w:tc>
+          <w:tcPr>
+            <w:tcW w:w="2485" w:type="dxa"/>
+            <w:tcBorders>
+              <w:top w:val="single" w:sz="4" w:space="0" w:color="000000"/>
+              <w:left w:val="single" w:sz="4" w:space="0" w:color="000000"/>
+              <w:bottom w:val="single" w:sz="4" w:space="0" w:color="000000"/>
+              <w:right w:val="single" w:sz="4" w:space="0" w:color="000000"/>
+            </w:tcBorders>
+          </w:tcPr>
+          <w:p>
+            <w:pPr>
+              <w:ind w:left="1"/>
+              <w:rPr>
+                <w:sz w:val="17"/>
+              </w:rPr>
+            </w:pPr>
+            <w:r>
+              <w:rPr>
+                <w:sz w:val="17"/>
+              </w:rPr>
+              <w:t>Design and integrate the Administrator User Management screen for staff accounts</w:t>
+            </w:r>
+          </w:p>
+        </w:tc>
+        <w:tc>
+          <w:tcPr>
+            <w:tcW w:w="2483" w:type="dxa"/>
+            <w:tcBorders>
+              <w:top w:val="single" w:sz="4" w:space="0" w:color="000000"/>
+              <w:left w:val="single" w:sz="4" w:space="0" w:color="000000"/>
+              <w:bottom w:val="single" w:sz="4" w:space="0" w:color="000000"/>
+              <w:right w:val="single" w:sz="4" w:space="0" w:color="000000"/>
+            </w:tcBorders>
+            <w:vAlign w:val="center"/>
+          </w:tcPr>
+          <w:p>
+            <w:pPr>
+              <w:ind w:left="1"/>
+              <w:rPr>
+                <w:sz w:val="17"/>
+              </w:rPr>
+            </w:pPr>
+            <w:r>
+              <w:rPr>
+                <w:sz w:val="17"/>
+              </w:rPr>
+              <w:t>1.4</w:t>
             </w:r>
           </w:p>
         </w:tc>
@@ -1098,6 +1291,7 @@
           <w:rFonts w:ascii="Arial" w:eastAsia="Arial" w:hAnsi="Arial" w:cs="Arial"/>
           <w:sz w:val="20"/>
         </w:rPr>
+        <w:lastRenderedPageBreak/>
         <w:t xml:space="preserve"> </w:t>
       </w:r>
       <w:r>
@@ -1124,6 +1318,7 @@
           <w:docPartGallery w:val="Table of Contents"/>
         </w:docPartObj>
       </w:sdtPr>
+      <w:sdtEndPr/>
       <w:sdtContent>
         <w:p>
           <w:pPr>
@@ -1231,8 +1426,14 @@
           <w:pPr>
             <w:pStyle w:val="TOC1"/>
             <w:tabs>
-              <w:tab w:val="right" w:leader="dot" w:pos="9895"/>
+              <w:tab w:val="right" w:leader="dot" w:pos="9885"/>
             </w:tabs>
+            <w:rPr>
+              <w:rFonts w:asciiTheme="minorHAnsi" w:eastAsiaTheme="minorEastAsia" w:hAnsiTheme="minorHAnsi" w:cstheme="minorBidi"/>
+              <w:noProof/>
+              <w:color w:val="auto"/>
+              <w:sz w:val="24"/>
+            </w:rPr>
           </w:pPr>
           <w:r>
             <w:fldChar w:fldCharType="begin"/>
@@ -1243,26 +1444,60 @@
           <w:r>
             <w:fldChar w:fldCharType="separate"/>
           </w:r>
-          <w:hyperlink w:anchor="_Toc25282">
-            <w:r>
+          <w:hyperlink w:anchor="_Toc244301944" w:history="1">
+            <w:r>
+              <w:rPr>
+                <w:rStyle w:val="Hyperlink"/>
+                <w:noProof/>
+              </w:rPr>
               <w:t>2. Document Overview</w:t>
             </w:r>
             <w:r>
+              <w:rPr>
+                <w:noProof/>
+                <w:webHidden/>
+              </w:rPr>
               <w:tab/>
             </w:r>
             <w:r>
+              <w:rPr>
+                <w:noProof/>
+                <w:webHidden/>
+              </w:rPr>
               <w:fldChar w:fldCharType="begin"/>
             </w:r>
             <w:r>
-              <w:instrText>PAGEREF _Toc25282 \h</w:instrText>
-            </w:r>
-            <w:r>
+              <w:rPr>
+                <w:noProof/>
+                <w:webHidden/>
+              </w:rPr>
+              <w:instrText xml:space="preserve"> PAGEREF _Toc244301944 \h </w:instrText>
+            </w:r>
+            <w:r>
+              <w:rPr>
+                <w:noProof/>
+                <w:webHidden/>
+              </w:rPr>
+            </w:r>
+            <w:r>
+              <w:rPr>
+                <w:noProof/>
+                <w:webHidden/>
+              </w:rPr>
               <w:fldChar w:fldCharType="separate"/>
             </w:r>
             <w:r>
-              <w:t xml:space="preserve">2 </w:t>
-            </w:r>
-            <w:r>
+              <w:rPr>
+                <w:noProof/>
+                <w:webHidden/>
+              </w:rPr>
+              <w:t>4</w:t>
+            </w:r>
+            <w:r>
+              <w:rPr>
+                <w:noProof/>
+                <w:webHidden/>
+              </w:rPr>
               <w:fldChar w:fldCharType="end"/>
             </w:r>
           </w:hyperlink>
@@ -1271,32 +1506,69 @@
           <w:pPr>
             <w:pStyle w:val="TOC2"/>
             <w:tabs>
-              <w:tab w:val="right" w:leader="dot" w:pos="9895"/>
+              <w:tab w:val="right" w:leader="dot" w:pos="9885"/>
             </w:tabs>
+            <w:rPr>
+              <w:rFonts w:asciiTheme="minorHAnsi" w:eastAsiaTheme="minorEastAsia" w:hAnsiTheme="minorHAnsi" w:cstheme="minorBidi"/>
+              <w:noProof/>
+              <w:color w:val="auto"/>
+              <w:sz w:val="24"/>
+            </w:rPr>
           </w:pPr>
-          <w:hyperlink w:anchor="_Toc25283">
-            <w:r>
-              <w:t>2.2 Related Documents .............................................................................................................................. 2</w:t>
-            </w:r>
-            <w:r>
-              <w:rPr>
-                <w:sz w:val="20"/>
-              </w:rPr>
-              <w:t xml:space="preserve"> </w:t>
-            </w:r>
-            <w:r>
+          <w:hyperlink w:anchor="_Toc244301945" w:history="1">
+            <w:r>
+              <w:rPr>
+                <w:rStyle w:val="Hyperlink"/>
+                <w:noProof/>
+              </w:rPr>
+              <w:t>2.2 Related Documents</w:t>
+            </w:r>
+            <w:r>
+              <w:rPr>
+                <w:noProof/>
+                <w:webHidden/>
+              </w:rPr>
               <w:tab/>
             </w:r>
             <w:r>
+              <w:rPr>
+                <w:noProof/>
+                <w:webHidden/>
+              </w:rPr>
               <w:fldChar w:fldCharType="begin"/>
             </w:r>
             <w:r>
-              <w:instrText>PAGEREF _Toc25283 \h</w:instrText>
-            </w:r>
-            <w:r>
+              <w:rPr>
+                <w:noProof/>
+                <w:webHidden/>
+              </w:rPr>
+              <w:instrText xml:space="preserve"> PAGEREF _Toc244301945 \h </w:instrText>
+            </w:r>
+            <w:r>
+              <w:rPr>
+                <w:noProof/>
+                <w:webHidden/>
+              </w:rPr>
+            </w:r>
+            <w:r>
+              <w:rPr>
+                <w:noProof/>
+                <w:webHidden/>
+              </w:rPr>
               <w:fldChar w:fldCharType="separate"/>
             </w:r>
             <w:r>
+              <w:rPr>
+                <w:noProof/>
+                <w:webHidden/>
+              </w:rPr>
+              <w:t>4</w:t>
+            </w:r>
+            <w:r>
+              <w:rPr>
+                <w:noProof/>
+                <w:webHidden/>
+              </w:rPr>
               <w:fldChar w:fldCharType="end"/>
             </w:r>
           </w:hyperlink>
@@ -1305,29 +1577,69 @@
           <w:pPr>
             <w:pStyle w:val="TOC1"/>
             <w:tabs>
-              <w:tab w:val="right" w:leader="dot" w:pos="9895"/>
+              <w:tab w:val="right" w:leader="dot" w:pos="9885"/>
             </w:tabs>
+            <w:rPr>
+              <w:rFonts w:asciiTheme="minorHAnsi" w:eastAsiaTheme="minorEastAsia" w:hAnsiTheme="minorHAnsi" w:cstheme="minorBidi"/>
+              <w:noProof/>
+              <w:color w:val="auto"/>
+              <w:sz w:val="24"/>
+            </w:rPr>
           </w:pPr>
-          <w:hyperlink w:anchor="_Toc25284">
-            <w:r>
+          <w:hyperlink w:anchor="_Toc244301946" w:history="1">
+            <w:r>
+              <w:rPr>
+                <w:rStyle w:val="Hyperlink"/>
+                <w:noProof/>
+              </w:rPr>
               <w:t>3. Architecture</w:t>
             </w:r>
             <w:r>
+              <w:rPr>
+                <w:noProof/>
+                <w:webHidden/>
+              </w:rPr>
               <w:tab/>
             </w:r>
             <w:r>
+              <w:rPr>
+                <w:noProof/>
+                <w:webHidden/>
+              </w:rPr>
               <w:fldChar w:fldCharType="begin"/>
             </w:r>
             <w:r>
-              <w:instrText>PAGEREF _Toc25284 \h</w:instrText>
-            </w:r>
-            <w:r>
+              <w:rPr>
+                <w:noProof/>
+                <w:webHidden/>
+              </w:rPr>
+              <w:instrText xml:space="preserve"> PAGEREF _Toc244301946 \h </w:instrText>
+            </w:r>
+            <w:r>
+              <w:rPr>
+                <w:noProof/>
+                <w:webHidden/>
+              </w:rPr>
+            </w:r>
+            <w:r>
+              <w:rPr>
+                <w:noProof/>
+                <w:webHidden/>
+              </w:rPr>
               <w:fldChar w:fldCharType="separate"/>
             </w:r>
             <w:r>
-              <w:t xml:space="preserve">3 </w:t>
-            </w:r>
-            <w:r>
+              <w:rPr>
+                <w:noProof/>
+                <w:webHidden/>
+              </w:rPr>
+              <w:t>4</w:t>
+            </w:r>
+            <w:r>
+              <w:rPr>
+                <w:noProof/>
+                <w:webHidden/>
+              </w:rPr>
               <w:fldChar w:fldCharType="end"/>
             </w:r>
           </w:hyperlink>
@@ -1336,29 +1648,69 @@
           <w:pPr>
             <w:pStyle w:val="TOC2"/>
             <w:tabs>
-              <w:tab w:val="right" w:leader="dot" w:pos="9895"/>
+              <w:tab w:val="right" w:leader="dot" w:pos="9885"/>
             </w:tabs>
+            <w:rPr>
+              <w:rFonts w:asciiTheme="minorHAnsi" w:eastAsiaTheme="minorEastAsia" w:hAnsiTheme="minorHAnsi" w:cstheme="minorBidi"/>
+              <w:noProof/>
+              <w:color w:val="auto"/>
+              <w:sz w:val="24"/>
+            </w:rPr>
           </w:pPr>
-          <w:hyperlink w:anchor="_Toc25285">
-            <w:r>
+          <w:hyperlink w:anchor="_Toc244301947" w:history="1">
+            <w:r>
+              <w:rPr>
+                <w:rStyle w:val="Hyperlink"/>
+                <w:noProof/>
+              </w:rPr>
               <w:t>3.1 Architecture Goals and Constraints</w:t>
             </w:r>
             <w:r>
+              <w:rPr>
+                <w:noProof/>
+                <w:webHidden/>
+              </w:rPr>
               <w:tab/>
             </w:r>
             <w:r>
+              <w:rPr>
+                <w:noProof/>
+                <w:webHidden/>
+              </w:rPr>
               <w:fldChar w:fldCharType="begin"/>
             </w:r>
             <w:r>
-              <w:instrText>PAGEREF _Toc25285 \h</w:instrText>
-            </w:r>
-            <w:r>
+              <w:rPr>
+                <w:noProof/>
+                <w:webHidden/>
+              </w:rPr>
+              <w:instrText xml:space="preserve"> PAGEREF _Toc244301947 \h </w:instrText>
+            </w:r>
+            <w:r>
+              <w:rPr>
+                <w:noProof/>
+                <w:webHidden/>
+              </w:rPr>
+            </w:r>
+            <w:r>
+              <w:rPr>
+                <w:noProof/>
+                <w:webHidden/>
+              </w:rPr>
               <w:fldChar w:fldCharType="separate"/>
             </w:r>
             <w:r>
-              <w:t xml:space="preserve">3 </w:t>
-            </w:r>
-            <w:r>
+              <w:rPr>
+                <w:noProof/>
+                <w:webHidden/>
+              </w:rPr>
+              <w:t>4</w:t>
+            </w:r>
+            <w:r>
+              <w:rPr>
+                <w:noProof/>
+                <w:webHidden/>
+              </w:rPr>
               <w:fldChar w:fldCharType="end"/>
             </w:r>
           </w:hyperlink>
@@ -1367,29 +1719,69 @@
           <w:pPr>
             <w:pStyle w:val="TOC2"/>
             <w:tabs>
-              <w:tab w:val="right" w:leader="dot" w:pos="9895"/>
+              <w:tab w:val="right" w:leader="dot" w:pos="9885"/>
             </w:tabs>
+            <w:rPr>
+              <w:rFonts w:asciiTheme="minorHAnsi" w:eastAsiaTheme="minorEastAsia" w:hAnsiTheme="minorHAnsi" w:cstheme="minorBidi"/>
+              <w:noProof/>
+              <w:color w:val="auto"/>
+              <w:sz w:val="24"/>
+            </w:rPr>
           </w:pPr>
-          <w:hyperlink w:anchor="_Toc25286">
-            <w:r>
+          <w:hyperlink w:anchor="_Toc244301948" w:history="1">
+            <w:r>
+              <w:rPr>
+                <w:rStyle w:val="Hyperlink"/>
+                <w:noProof/>
+              </w:rPr>
               <w:t>3.2 Stakeholders and Concerns</w:t>
             </w:r>
             <w:r>
+              <w:rPr>
+                <w:noProof/>
+                <w:webHidden/>
+              </w:rPr>
               <w:tab/>
             </w:r>
             <w:r>
+              <w:rPr>
+                <w:noProof/>
+                <w:webHidden/>
+              </w:rPr>
               <w:fldChar w:fldCharType="begin"/>
             </w:r>
             <w:r>
-              <w:instrText>PAGEREF _Toc25286 \h</w:instrText>
-            </w:r>
-            <w:r>
+              <w:rPr>
+                <w:noProof/>
+                <w:webHidden/>
+              </w:rPr>
+              <w:instrText xml:space="preserve"> PAGEREF _Toc244301948 \h </w:instrText>
+            </w:r>
+            <w:r>
+              <w:rPr>
+                <w:noProof/>
+                <w:webHidden/>
+              </w:rPr>
+            </w:r>
+            <w:r>
+              <w:rPr>
+                <w:noProof/>
+                <w:webHidden/>
+              </w:rPr>
               <w:fldChar w:fldCharType="separate"/>
             </w:r>
             <w:r>
-              <w:t xml:space="preserve">3 </w:t>
-            </w:r>
-            <w:r>
+              <w:rPr>
+                <w:noProof/>
+                <w:webHidden/>
+              </w:rPr>
+              <w:t>4</w:t>
+            </w:r>
+            <w:r>
+              <w:rPr>
+                <w:noProof/>
+                <w:webHidden/>
+              </w:rPr>
               <w:fldChar w:fldCharType="end"/>
             </w:r>
           </w:hyperlink>
@@ -1398,29 +1790,69 @@
           <w:pPr>
             <w:pStyle w:val="TOC2"/>
             <w:tabs>
-              <w:tab w:val="right" w:leader="dot" w:pos="9895"/>
+              <w:tab w:val="right" w:leader="dot" w:pos="9885"/>
             </w:tabs>
+            <w:rPr>
+              <w:rFonts w:asciiTheme="minorHAnsi" w:eastAsiaTheme="minorEastAsia" w:hAnsiTheme="minorHAnsi" w:cstheme="minorBidi"/>
+              <w:noProof/>
+              <w:color w:val="auto"/>
+              <w:sz w:val="24"/>
+            </w:rPr>
           </w:pPr>
-          <w:hyperlink w:anchor="_Toc25287">
-            <w:r>
+          <w:hyperlink w:anchor="_Toc244301949" w:history="1">
+            <w:r>
+              <w:rPr>
+                <w:rStyle w:val="Hyperlink"/>
+                <w:noProof/>
+              </w:rPr>
               <w:t>3.3 Component Diagram</w:t>
             </w:r>
             <w:r>
+              <w:rPr>
+                <w:noProof/>
+                <w:webHidden/>
+              </w:rPr>
               <w:tab/>
             </w:r>
             <w:r>
+              <w:rPr>
+                <w:noProof/>
+                <w:webHidden/>
+              </w:rPr>
               <w:fldChar w:fldCharType="begin"/>
             </w:r>
             <w:r>
-              <w:instrText>PAGEREF _Toc25287 \h</w:instrText>
-            </w:r>
-            <w:r>
+              <w:rPr>
+                <w:noProof/>
+                <w:webHidden/>
+              </w:rPr>
+              <w:instrText xml:space="preserve"> PAGEREF _Toc244301949 \h </w:instrText>
+            </w:r>
+            <w:r>
+              <w:rPr>
+                <w:noProof/>
+                <w:webHidden/>
+              </w:rPr>
+            </w:r>
+            <w:r>
+              <w:rPr>
+                <w:noProof/>
+                <w:webHidden/>
+              </w:rPr>
               <w:fldChar w:fldCharType="separate"/>
             </w:r>
             <w:r>
-              <w:t xml:space="preserve">3 </w:t>
-            </w:r>
-            <w:r>
+              <w:rPr>
+                <w:noProof/>
+                <w:webHidden/>
+              </w:rPr>
+              <w:t>5</w:t>
+            </w:r>
+            <w:r>
+              <w:rPr>
+                <w:noProof/>
+                <w:webHidden/>
+              </w:rPr>
               <w:fldChar w:fldCharType="end"/>
             </w:r>
           </w:hyperlink>
@@ -1429,32 +1861,69 @@
           <w:pPr>
             <w:pStyle w:val="TOC2"/>
             <w:tabs>
-              <w:tab w:val="right" w:leader="dot" w:pos="9895"/>
+              <w:tab w:val="right" w:leader="dot" w:pos="9885"/>
             </w:tabs>
+            <w:rPr>
+              <w:rFonts w:asciiTheme="minorHAnsi" w:eastAsiaTheme="minorEastAsia" w:hAnsiTheme="minorHAnsi" w:cstheme="minorBidi"/>
+              <w:noProof/>
+              <w:color w:val="auto"/>
+              <w:sz w:val="24"/>
+            </w:rPr>
           </w:pPr>
-          <w:hyperlink w:anchor="_Toc25288">
-            <w:r>
-              <w:t>3.4 Component Descriptions ...................................................................................................................... 4</w:t>
-            </w:r>
-            <w:r>
-              <w:rPr>
-                <w:sz w:val="20"/>
-              </w:rPr>
-              <w:t xml:space="preserve"> </w:t>
-            </w:r>
-            <w:r>
+          <w:hyperlink w:anchor="_Toc244301950" w:history="1">
+            <w:r>
+              <w:rPr>
+                <w:rStyle w:val="Hyperlink"/>
+                <w:noProof/>
+              </w:rPr>
+              <w:t>3.4 Component Descriptions</w:t>
+            </w:r>
+            <w:r>
+              <w:rPr>
+                <w:noProof/>
+                <w:webHidden/>
+              </w:rPr>
               <w:tab/>
             </w:r>
             <w:r>
+              <w:rPr>
+                <w:noProof/>
+                <w:webHidden/>
+              </w:rPr>
               <w:fldChar w:fldCharType="begin"/>
             </w:r>
             <w:r>
-              <w:instrText>PAGEREF _Toc25288 \h</w:instrText>
-            </w:r>
-            <w:r>
+              <w:rPr>
+                <w:noProof/>
+                <w:webHidden/>
+              </w:rPr>
+              <w:instrText xml:space="preserve"> PAGEREF _Toc244301950 \h </w:instrText>
+            </w:r>
+            <w:r>
+              <w:rPr>
+                <w:noProof/>
+                <w:webHidden/>
+              </w:rPr>
+            </w:r>
+            <w:r>
+              <w:rPr>
+                <w:noProof/>
+                <w:webHidden/>
+              </w:rPr>
               <w:fldChar w:fldCharType="separate"/>
             </w:r>
             <w:r>
+              <w:rPr>
+                <w:noProof/>
+                <w:webHidden/>
+              </w:rPr>
+              <w:t>5</w:t>
+            </w:r>
+            <w:r>
+              <w:rPr>
+                <w:noProof/>
+                <w:webHidden/>
+              </w:rPr>
               <w:fldChar w:fldCharType="end"/>
             </w:r>
           </w:hyperlink>
@@ -1463,29 +1932,69 @@
           <w:pPr>
             <w:pStyle w:val="TOC2"/>
             <w:tabs>
-              <w:tab w:val="right" w:leader="dot" w:pos="9895"/>
+              <w:tab w:val="right" w:leader="dot" w:pos="9885"/>
             </w:tabs>
+            <w:rPr>
+              <w:rFonts w:asciiTheme="minorHAnsi" w:eastAsiaTheme="minorEastAsia" w:hAnsiTheme="minorHAnsi" w:cstheme="minorBidi"/>
+              <w:noProof/>
+              <w:color w:val="auto"/>
+              <w:sz w:val="24"/>
+            </w:rPr>
           </w:pPr>
-          <w:hyperlink w:anchor="_Toc25289">
-            <w:r>
+          <w:hyperlink w:anchor="_Toc244301951" w:history="1">
+            <w:r>
+              <w:rPr>
+                <w:rStyle w:val="Hyperlink"/>
+                <w:noProof/>
+              </w:rPr>
               <w:t>3.5 Chosen Architecture Pattern and Rationale</w:t>
             </w:r>
             <w:r>
+              <w:rPr>
+                <w:noProof/>
+                <w:webHidden/>
+              </w:rPr>
               <w:tab/>
             </w:r>
             <w:r>
+              <w:rPr>
+                <w:noProof/>
+                <w:webHidden/>
+              </w:rPr>
               <w:fldChar w:fldCharType="begin"/>
             </w:r>
             <w:r>
-              <w:instrText>PAGEREF _Toc25289 \h</w:instrText>
-            </w:r>
-            <w:r>
+              <w:rPr>
+                <w:noProof/>
+                <w:webHidden/>
+              </w:rPr>
+              <w:instrText xml:space="preserve"> PAGEREF _Toc244301951 \h </w:instrText>
+            </w:r>
+            <w:r>
+              <w:rPr>
+                <w:noProof/>
+                <w:webHidden/>
+              </w:rPr>
+            </w:r>
+            <w:r>
+              <w:rPr>
+                <w:noProof/>
+                <w:webHidden/>
+              </w:rPr>
               <w:fldChar w:fldCharType="separate"/>
             </w:r>
             <w:r>
-              <w:t xml:space="preserve">4 </w:t>
-            </w:r>
-            <w:r>
+              <w:rPr>
+                <w:noProof/>
+                <w:webHidden/>
+              </w:rPr>
+              <w:t>6</w:t>
+            </w:r>
+            <w:r>
+              <w:rPr>
+                <w:noProof/>
+                <w:webHidden/>
+              </w:rPr>
               <w:fldChar w:fldCharType="end"/>
             </w:r>
           </w:hyperlink>
@@ -1494,29 +2003,69 @@
           <w:pPr>
             <w:pStyle w:val="TOC2"/>
             <w:tabs>
-              <w:tab w:val="right" w:leader="dot" w:pos="9895"/>
+              <w:tab w:val="right" w:leader="dot" w:pos="9885"/>
             </w:tabs>
+            <w:rPr>
+              <w:rFonts w:asciiTheme="minorHAnsi" w:eastAsiaTheme="minorEastAsia" w:hAnsiTheme="minorHAnsi" w:cstheme="minorBidi"/>
+              <w:noProof/>
+              <w:color w:val="auto"/>
+              <w:sz w:val="24"/>
+            </w:rPr>
           </w:pPr>
-          <w:hyperlink w:anchor="_Toc25290">
-            <w:r>
+          <w:hyperlink w:anchor="_Toc244301952" w:history="1">
+            <w:r>
+              <w:rPr>
+                <w:rStyle w:val="Hyperlink"/>
+                <w:noProof/>
+              </w:rPr>
               <w:t>3.6 Technology Stack &amp; Data Stores</w:t>
             </w:r>
             <w:r>
+              <w:rPr>
+                <w:noProof/>
+                <w:webHidden/>
+              </w:rPr>
               <w:tab/>
             </w:r>
             <w:r>
+              <w:rPr>
+                <w:noProof/>
+                <w:webHidden/>
+              </w:rPr>
               <w:fldChar w:fldCharType="begin"/>
             </w:r>
             <w:r>
-              <w:instrText>PAGEREF _Toc25290 \h</w:instrText>
-            </w:r>
-            <w:r>
+              <w:rPr>
+                <w:noProof/>
+                <w:webHidden/>
+              </w:rPr>
+              <w:instrText xml:space="preserve"> PAGEREF _Toc244301952 \h </w:instrText>
+            </w:r>
+            <w:r>
+              <w:rPr>
+                <w:noProof/>
+                <w:webHidden/>
+              </w:rPr>
+            </w:r>
+            <w:r>
+              <w:rPr>
+                <w:noProof/>
+                <w:webHidden/>
+              </w:rPr>
               <w:fldChar w:fldCharType="separate"/>
             </w:r>
             <w:r>
-              <w:t xml:space="preserve">4 </w:t>
-            </w:r>
-            <w:r>
+              <w:rPr>
+                <w:noProof/>
+                <w:webHidden/>
+              </w:rPr>
+              <w:t>6</w:t>
+            </w:r>
+            <w:r>
+              <w:rPr>
+                <w:noProof/>
+                <w:webHidden/>
+              </w:rPr>
               <w:fldChar w:fldCharType="end"/>
             </w:r>
           </w:hyperlink>
@@ -1525,29 +2074,69 @@
           <w:pPr>
             <w:pStyle w:val="TOC2"/>
             <w:tabs>
-              <w:tab w:val="right" w:leader="dot" w:pos="9895"/>
+              <w:tab w:val="right" w:leader="dot" w:pos="9885"/>
             </w:tabs>
+            <w:rPr>
+              <w:rFonts w:asciiTheme="minorHAnsi" w:eastAsiaTheme="minorEastAsia" w:hAnsiTheme="minorHAnsi" w:cstheme="minorBidi"/>
+              <w:noProof/>
+              <w:color w:val="auto"/>
+              <w:sz w:val="24"/>
+            </w:rPr>
           </w:pPr>
-          <w:hyperlink w:anchor="_Toc25291">
-            <w:r>
+          <w:hyperlink w:anchor="_Toc244301953" w:history="1">
+            <w:r>
+              <w:rPr>
+                <w:rStyle w:val="Hyperlink"/>
+                <w:noProof/>
+              </w:rPr>
               <w:t>3.7 Risks &amp; Mitigations</w:t>
             </w:r>
             <w:r>
+              <w:rPr>
+                <w:noProof/>
+                <w:webHidden/>
+              </w:rPr>
               <w:tab/>
             </w:r>
             <w:r>
+              <w:rPr>
+                <w:noProof/>
+                <w:webHidden/>
+              </w:rPr>
               <w:fldChar w:fldCharType="begin"/>
             </w:r>
             <w:r>
-              <w:instrText>PAGEREF _Toc25291 \h</w:instrText>
-            </w:r>
-            <w:r>
+              <w:rPr>
+                <w:noProof/>
+                <w:webHidden/>
+              </w:rPr>
+              <w:instrText xml:space="preserve"> PAGEREF _Toc244301953 \h </w:instrText>
+            </w:r>
+            <w:r>
+              <w:rPr>
+                <w:noProof/>
+                <w:webHidden/>
+              </w:rPr>
+            </w:r>
+            <w:r>
+              <w:rPr>
+                <w:noProof/>
+                <w:webHidden/>
+              </w:rPr>
               <w:fldChar w:fldCharType="separate"/>
             </w:r>
             <w:r>
-              <w:t xml:space="preserve">5 </w:t>
-            </w:r>
-            <w:r>
+              <w:rPr>
+                <w:noProof/>
+                <w:webHidden/>
+              </w:rPr>
+              <w:t>6</w:t>
+            </w:r>
+            <w:r>
+              <w:rPr>
+                <w:noProof/>
+                <w:webHidden/>
+              </w:rPr>
               <w:fldChar w:fldCharType="end"/>
             </w:r>
           </w:hyperlink>
@@ -1556,29 +2145,69 @@
           <w:pPr>
             <w:pStyle w:val="TOC2"/>
             <w:tabs>
-              <w:tab w:val="right" w:leader="dot" w:pos="9895"/>
+              <w:tab w:val="right" w:leader="dot" w:pos="9885"/>
             </w:tabs>
+            <w:rPr>
+              <w:rFonts w:asciiTheme="minorHAnsi" w:eastAsiaTheme="minorEastAsia" w:hAnsiTheme="minorHAnsi" w:cstheme="minorBidi"/>
+              <w:noProof/>
+              <w:color w:val="auto"/>
+              <w:sz w:val="24"/>
+            </w:rPr>
           </w:pPr>
-          <w:hyperlink w:anchor="_Toc25292">
-            <w:r>
+          <w:hyperlink w:anchor="_Toc244301954" w:history="1">
+            <w:r>
+              <w:rPr>
+                <w:rStyle w:val="Hyperlink"/>
+                <w:noProof/>
+              </w:rPr>
               <w:t>3.8 Traceability to Requirements</w:t>
             </w:r>
             <w:r>
+              <w:rPr>
+                <w:noProof/>
+                <w:webHidden/>
+              </w:rPr>
               <w:tab/>
             </w:r>
             <w:r>
+              <w:rPr>
+                <w:noProof/>
+                <w:webHidden/>
+              </w:rPr>
               <w:fldChar w:fldCharType="begin"/>
             </w:r>
             <w:r>
-              <w:instrText>PAGEREF _Toc25292 \h</w:instrText>
-            </w:r>
-            <w:r>
+              <w:rPr>
+                <w:noProof/>
+                <w:webHidden/>
+              </w:rPr>
+              <w:instrText xml:space="preserve"> PAGEREF _Toc244301954 \h </w:instrText>
+            </w:r>
+            <w:r>
+              <w:rPr>
+                <w:noProof/>
+                <w:webHidden/>
+              </w:rPr>
+            </w:r>
+            <w:r>
+              <w:rPr>
+                <w:noProof/>
+                <w:webHidden/>
+              </w:rPr>
               <w:fldChar w:fldCharType="separate"/>
             </w:r>
             <w:r>
-              <w:t xml:space="preserve">5 </w:t>
-            </w:r>
-            <w:r>
+              <w:rPr>
+                <w:noProof/>
+                <w:webHidden/>
+              </w:rPr>
+              <w:t>7</w:t>
+            </w:r>
+            <w:r>
+              <w:rPr>
+                <w:noProof/>
+                <w:webHidden/>
+              </w:rPr>
               <w:fldChar w:fldCharType="end"/>
             </w:r>
           </w:hyperlink>
@@ -1587,29 +2216,69 @@
           <w:pPr>
             <w:pStyle w:val="TOC2"/>
             <w:tabs>
-              <w:tab w:val="right" w:leader="dot" w:pos="9895"/>
+              <w:tab w:val="right" w:leader="dot" w:pos="9885"/>
             </w:tabs>
+            <w:rPr>
+              <w:rFonts w:asciiTheme="minorHAnsi" w:eastAsiaTheme="minorEastAsia" w:hAnsiTheme="minorHAnsi" w:cstheme="minorBidi"/>
+              <w:noProof/>
+              <w:color w:val="auto"/>
+              <w:sz w:val="24"/>
+            </w:rPr>
           </w:pPr>
-          <w:hyperlink w:anchor="_Toc25293">
-            <w:r>
+          <w:hyperlink w:anchor="_Toc244301955" w:history="1">
+            <w:r>
+              <w:rPr>
+                <w:rStyle w:val="Hyperlink"/>
+                <w:noProof/>
+              </w:rPr>
               <w:t>3.9 Security Architecture</w:t>
             </w:r>
             <w:r>
+              <w:rPr>
+                <w:noProof/>
+                <w:webHidden/>
+              </w:rPr>
               <w:tab/>
             </w:r>
             <w:r>
+              <w:rPr>
+                <w:noProof/>
+                <w:webHidden/>
+              </w:rPr>
               <w:fldChar w:fldCharType="begin"/>
             </w:r>
             <w:r>
-              <w:instrText>PAGEREF _Toc25293 \h</w:instrText>
-            </w:r>
-            <w:r>
+              <w:rPr>
+                <w:noProof/>
+                <w:webHidden/>
+              </w:rPr>
+              <w:instrText xml:space="preserve"> PAGEREF _Toc244301955 \h </w:instrText>
+            </w:r>
+            <w:r>
+              <w:rPr>
+                <w:noProof/>
+                <w:webHidden/>
+              </w:rPr>
+            </w:r>
+            <w:r>
+              <w:rPr>
+                <w:noProof/>
+                <w:webHidden/>
+              </w:rPr>
               <w:fldChar w:fldCharType="separate"/>
             </w:r>
             <w:r>
-              <w:t xml:space="preserve">5 </w:t>
-            </w:r>
-            <w:r>
+              <w:rPr>
+                <w:noProof/>
+                <w:webHidden/>
+              </w:rPr>
+              <w:t>7</w:t>
+            </w:r>
+            <w:r>
+              <w:rPr>
+                <w:noProof/>
+                <w:webHidden/>
+              </w:rPr>
               <w:fldChar w:fldCharType="end"/>
             </w:r>
           </w:hyperlink>
@@ -1618,29 +2287,69 @@
           <w:pPr>
             <w:pStyle w:val="TOC1"/>
             <w:tabs>
-              <w:tab w:val="right" w:leader="dot" w:pos="9895"/>
+              <w:tab w:val="right" w:leader="dot" w:pos="9885"/>
             </w:tabs>
+            <w:rPr>
+              <w:rFonts w:asciiTheme="minorHAnsi" w:eastAsiaTheme="minorEastAsia" w:hAnsiTheme="minorHAnsi" w:cstheme="minorBidi"/>
+              <w:noProof/>
+              <w:color w:val="auto"/>
+              <w:sz w:val="24"/>
+            </w:rPr>
           </w:pPr>
-          <w:hyperlink w:anchor="_Toc25294">
-            <w:r>
+          <w:hyperlink w:anchor="_Toc244301956" w:history="1">
+            <w:r>
+              <w:rPr>
+                <w:rStyle w:val="Hyperlink"/>
+                <w:noProof/>
+              </w:rPr>
               <w:t>4. Design</w:t>
             </w:r>
             <w:r>
+              <w:rPr>
+                <w:noProof/>
+                <w:webHidden/>
+              </w:rPr>
               <w:tab/>
             </w:r>
             <w:r>
+              <w:rPr>
+                <w:noProof/>
+                <w:webHidden/>
+              </w:rPr>
               <w:fldChar w:fldCharType="begin"/>
             </w:r>
             <w:r>
-              <w:instrText>PAGEREF _Toc25294 \h</w:instrText>
-            </w:r>
-            <w:r>
+              <w:rPr>
+                <w:noProof/>
+                <w:webHidden/>
+              </w:rPr>
+              <w:instrText xml:space="preserve"> PAGEREF _Toc244301956 \h </w:instrText>
+            </w:r>
+            <w:r>
+              <w:rPr>
+                <w:noProof/>
+                <w:webHidden/>
+              </w:rPr>
+            </w:r>
+            <w:r>
+              <w:rPr>
+                <w:noProof/>
+                <w:webHidden/>
+              </w:rPr>
               <w:fldChar w:fldCharType="separate"/>
             </w:r>
             <w:r>
-              <w:t xml:space="preserve">6 </w:t>
-            </w:r>
-            <w:r>
+              <w:rPr>
+                <w:noProof/>
+                <w:webHidden/>
+              </w:rPr>
+              <w:t>7</w:t>
+            </w:r>
+            <w:r>
+              <w:rPr>
+                <w:noProof/>
+                <w:webHidden/>
+              </w:rPr>
               <w:fldChar w:fldCharType="end"/>
             </w:r>
           </w:hyperlink>
@@ -1649,29 +2358,69 @@
           <w:pPr>
             <w:pStyle w:val="TOC2"/>
             <w:tabs>
-              <w:tab w:val="right" w:leader="dot" w:pos="9895"/>
+              <w:tab w:val="right" w:leader="dot" w:pos="9885"/>
             </w:tabs>
+            <w:rPr>
+              <w:rFonts w:asciiTheme="minorHAnsi" w:eastAsiaTheme="minorEastAsia" w:hAnsiTheme="minorHAnsi" w:cstheme="minorBidi"/>
+              <w:noProof/>
+              <w:color w:val="auto"/>
+              <w:sz w:val="24"/>
+            </w:rPr>
           </w:pPr>
-          <w:hyperlink w:anchor="_Toc25295">
-            <w:r>
+          <w:hyperlink w:anchor="_Toc244301957" w:history="1">
+            <w:r>
+              <w:rPr>
+                <w:rStyle w:val="Hyperlink"/>
+                <w:noProof/>
+              </w:rPr>
               <w:t>4.1 Design Overview</w:t>
             </w:r>
             <w:r>
+              <w:rPr>
+                <w:noProof/>
+                <w:webHidden/>
+              </w:rPr>
               <w:tab/>
             </w:r>
             <w:r>
+              <w:rPr>
+                <w:noProof/>
+                <w:webHidden/>
+              </w:rPr>
               <w:fldChar w:fldCharType="begin"/>
             </w:r>
             <w:r>
-              <w:instrText>PAGEREF _Toc25295 \h</w:instrText>
-            </w:r>
-            <w:r>
+              <w:rPr>
+                <w:noProof/>
+                <w:webHidden/>
+              </w:rPr>
+              <w:instrText xml:space="preserve"> PAGEREF _Toc244301957 \h </w:instrText>
+            </w:r>
+            <w:r>
+              <w:rPr>
+                <w:noProof/>
+                <w:webHidden/>
+              </w:rPr>
+            </w:r>
+            <w:r>
+              <w:rPr>
+                <w:noProof/>
+                <w:webHidden/>
+              </w:rPr>
               <w:fldChar w:fldCharType="separate"/>
             </w:r>
             <w:r>
-              <w:t xml:space="preserve">6 </w:t>
-            </w:r>
-            <w:r>
+              <w:rPr>
+                <w:noProof/>
+                <w:webHidden/>
+              </w:rPr>
+              <w:t>7</w:t>
+            </w:r>
+            <w:r>
+              <w:rPr>
+                <w:noProof/>
+                <w:webHidden/>
+              </w:rPr>
               <w:fldChar w:fldCharType="end"/>
             </w:r>
           </w:hyperlink>
@@ -1680,29 +2429,69 @@
           <w:pPr>
             <w:pStyle w:val="TOC2"/>
             <w:tabs>
-              <w:tab w:val="right" w:leader="dot" w:pos="9895"/>
+              <w:tab w:val="right" w:leader="dot" w:pos="9885"/>
             </w:tabs>
+            <w:rPr>
+              <w:rFonts w:asciiTheme="minorHAnsi" w:eastAsiaTheme="minorEastAsia" w:hAnsiTheme="minorHAnsi" w:cstheme="minorBidi"/>
+              <w:noProof/>
+              <w:color w:val="auto"/>
+              <w:sz w:val="24"/>
+            </w:rPr>
           </w:pPr>
-          <w:hyperlink w:anchor="_Toc25296">
-            <w:r>
+          <w:hyperlink w:anchor="_Toc244301958" w:history="1">
+            <w:r>
+              <w:rPr>
+                <w:rStyle w:val="Hyperlink"/>
+                <w:noProof/>
+              </w:rPr>
               <w:t>4.2 UML Sequence Diagrams</w:t>
             </w:r>
             <w:r>
+              <w:rPr>
+                <w:noProof/>
+                <w:webHidden/>
+              </w:rPr>
               <w:tab/>
             </w:r>
             <w:r>
+              <w:rPr>
+                <w:noProof/>
+                <w:webHidden/>
+              </w:rPr>
               <w:fldChar w:fldCharType="begin"/>
             </w:r>
             <w:r>
-              <w:instrText>PAGEREF _Toc25296 \h</w:instrText>
-            </w:r>
-            <w:r>
+              <w:rPr>
+                <w:noProof/>
+                <w:webHidden/>
+              </w:rPr>
+              <w:instrText xml:space="preserve"> PAGEREF _Toc244301958 \h </w:instrText>
+            </w:r>
+            <w:r>
+              <w:rPr>
+                <w:noProof/>
+                <w:webHidden/>
+              </w:rPr>
+            </w:r>
+            <w:r>
+              <w:rPr>
+                <w:noProof/>
+                <w:webHidden/>
+              </w:rPr>
               <w:fldChar w:fldCharType="separate"/>
             </w:r>
             <w:r>
-              <w:t xml:space="preserve">6 </w:t>
-            </w:r>
-            <w:r>
+              <w:rPr>
+                <w:noProof/>
+                <w:webHidden/>
+              </w:rPr>
+              <w:t>7</w:t>
+            </w:r>
+            <w:r>
+              <w:rPr>
+                <w:noProof/>
+                <w:webHidden/>
+              </w:rPr>
               <w:fldChar w:fldCharType="end"/>
             </w:r>
           </w:hyperlink>
@@ -1711,29 +2500,69 @@
           <w:pPr>
             <w:pStyle w:val="TOC3"/>
             <w:tabs>
-              <w:tab w:val="right" w:leader="dot" w:pos="9895"/>
+              <w:tab w:val="right" w:leader="dot" w:pos="9885"/>
             </w:tabs>
+            <w:rPr>
+              <w:rFonts w:asciiTheme="minorHAnsi" w:eastAsiaTheme="minorEastAsia" w:hAnsiTheme="minorHAnsi" w:cstheme="minorBidi"/>
+              <w:noProof/>
+              <w:color w:val="auto"/>
+              <w:sz w:val="24"/>
+            </w:rPr>
           </w:pPr>
-          <w:hyperlink w:anchor="_Toc25297">
-            <w:r>
+          <w:hyperlink w:anchor="_Toc244301959" w:history="1">
+            <w:r>
+              <w:rPr>
+                <w:rStyle w:val="Hyperlink"/>
+                <w:noProof/>
+              </w:rPr>
               <w:t>4.2.1 Create, Review and Validate Service Request</w:t>
             </w:r>
             <w:r>
+              <w:rPr>
+                <w:noProof/>
+                <w:webHidden/>
+              </w:rPr>
               <w:tab/>
             </w:r>
             <w:r>
+              <w:rPr>
+                <w:noProof/>
+                <w:webHidden/>
+              </w:rPr>
               <w:fldChar w:fldCharType="begin"/>
             </w:r>
             <w:r>
-              <w:instrText>PAGEREF _Toc25297 \h</w:instrText>
-            </w:r>
-            <w:r>
+              <w:rPr>
+                <w:noProof/>
+                <w:webHidden/>
+              </w:rPr>
+              <w:instrText xml:space="preserve"> PAGEREF _Toc244301959 \h </w:instrText>
+            </w:r>
+            <w:r>
+              <w:rPr>
+                <w:noProof/>
+                <w:webHidden/>
+              </w:rPr>
+            </w:r>
+            <w:r>
+              <w:rPr>
+                <w:noProof/>
+                <w:webHidden/>
+              </w:rPr>
               <w:fldChar w:fldCharType="separate"/>
             </w:r>
             <w:r>
-              <w:t xml:space="preserve">6 </w:t>
-            </w:r>
-            <w:r>
+              <w:rPr>
+                <w:noProof/>
+                <w:webHidden/>
+              </w:rPr>
+              <w:t>7</w:t>
+            </w:r>
+            <w:r>
+              <w:rPr>
+                <w:noProof/>
+                <w:webHidden/>
+              </w:rPr>
               <w:fldChar w:fldCharType="end"/>
             </w:r>
           </w:hyperlink>
@@ -1742,29 +2571,69 @@
           <w:pPr>
             <w:pStyle w:val="TOC3"/>
             <w:tabs>
-              <w:tab w:val="right" w:leader="dot" w:pos="9895"/>
+              <w:tab w:val="right" w:leader="dot" w:pos="9885"/>
             </w:tabs>
+            <w:rPr>
+              <w:rFonts w:asciiTheme="minorHAnsi" w:eastAsiaTheme="minorEastAsia" w:hAnsiTheme="minorHAnsi" w:cstheme="minorBidi"/>
+              <w:noProof/>
+              <w:color w:val="auto"/>
+              <w:sz w:val="24"/>
+            </w:rPr>
           </w:pPr>
-          <w:hyperlink w:anchor="_Toc25298">
-            <w:r>
+          <w:hyperlink w:anchor="_Toc244301960" w:history="1">
+            <w:r>
+              <w:rPr>
+                <w:rStyle w:val="Hyperlink"/>
+                <w:noProof/>
+              </w:rPr>
               <w:t>4.2.2 Assign Work, Perform Service and Complete Request</w:t>
             </w:r>
             <w:r>
+              <w:rPr>
+                <w:noProof/>
+                <w:webHidden/>
+              </w:rPr>
               <w:tab/>
             </w:r>
             <w:r>
+              <w:rPr>
+                <w:noProof/>
+                <w:webHidden/>
+              </w:rPr>
               <w:fldChar w:fldCharType="begin"/>
             </w:r>
             <w:r>
-              <w:instrText>PAGEREF _Toc25298 \h</w:instrText>
-            </w:r>
-            <w:r>
+              <w:rPr>
+                <w:noProof/>
+                <w:webHidden/>
+              </w:rPr>
+              <w:instrText xml:space="preserve"> PAGEREF _Toc244301960 \h </w:instrText>
+            </w:r>
+            <w:r>
+              <w:rPr>
+                <w:noProof/>
+                <w:webHidden/>
+              </w:rPr>
+            </w:r>
+            <w:r>
+              <w:rPr>
+                <w:noProof/>
+                <w:webHidden/>
+              </w:rPr>
               <w:fldChar w:fldCharType="separate"/>
             </w:r>
             <w:r>
-              <w:t xml:space="preserve">7 </w:t>
-            </w:r>
-            <w:r>
+              <w:rPr>
+                <w:noProof/>
+                <w:webHidden/>
+              </w:rPr>
+              <w:t>8</w:t>
+            </w:r>
+            <w:r>
+              <w:rPr>
+                <w:noProof/>
+                <w:webHidden/>
+              </w:rPr>
               <w:fldChar w:fldCharType="end"/>
             </w:r>
           </w:hyperlink>
@@ -1773,29 +2642,69 @@
           <w:pPr>
             <w:pStyle w:val="TOC2"/>
             <w:tabs>
-              <w:tab w:val="right" w:leader="dot" w:pos="9895"/>
+              <w:tab w:val="right" w:leader="dot" w:pos="9885"/>
             </w:tabs>
+            <w:rPr>
+              <w:rFonts w:asciiTheme="minorHAnsi" w:eastAsiaTheme="minorEastAsia" w:hAnsiTheme="minorHAnsi" w:cstheme="minorBidi"/>
+              <w:noProof/>
+              <w:color w:val="auto"/>
+              <w:sz w:val="24"/>
+            </w:rPr>
           </w:pPr>
-          <w:hyperlink w:anchor="_Toc25299">
-            <w:r>
+          <w:hyperlink w:anchor="_Toc244301961" w:history="1">
+            <w:r>
+              <w:rPr>
+                <w:rStyle w:val="Hyperlink"/>
+                <w:noProof/>
+              </w:rPr>
               <w:t>4.3 API Design</w:t>
             </w:r>
             <w:r>
+              <w:rPr>
+                <w:noProof/>
+                <w:webHidden/>
+              </w:rPr>
               <w:tab/>
             </w:r>
             <w:r>
+              <w:rPr>
+                <w:noProof/>
+                <w:webHidden/>
+              </w:rPr>
               <w:fldChar w:fldCharType="begin"/>
             </w:r>
             <w:r>
-              <w:instrText>PAGEREF _Toc25299 \h</w:instrText>
-            </w:r>
-            <w:r>
+              <w:rPr>
+                <w:noProof/>
+                <w:webHidden/>
+              </w:rPr>
+              <w:instrText xml:space="preserve"> PAGEREF _Toc244301961 \h </w:instrText>
+            </w:r>
+            <w:r>
+              <w:rPr>
+                <w:noProof/>
+                <w:webHidden/>
+              </w:rPr>
+            </w:r>
+            <w:r>
+              <w:rPr>
+                <w:noProof/>
+                <w:webHidden/>
+              </w:rPr>
               <w:fldChar w:fldCharType="separate"/>
             </w:r>
             <w:r>
-              <w:t xml:space="preserve">8 </w:t>
-            </w:r>
-            <w:r>
+              <w:rPr>
+                <w:noProof/>
+                <w:webHidden/>
+              </w:rPr>
+              <w:t>9</w:t>
+            </w:r>
+            <w:r>
+              <w:rPr>
+                <w:noProof/>
+                <w:webHidden/>
+              </w:rPr>
               <w:fldChar w:fldCharType="end"/>
             </w:r>
           </w:hyperlink>
@@ -1804,29 +2713,69 @@
           <w:pPr>
             <w:pStyle w:val="TOC2"/>
             <w:tabs>
-              <w:tab w:val="right" w:leader="dot" w:pos="9895"/>
+              <w:tab w:val="right" w:leader="dot" w:pos="9885"/>
             </w:tabs>
+            <w:rPr>
+              <w:rFonts w:asciiTheme="minorHAnsi" w:eastAsiaTheme="minorEastAsia" w:hAnsiTheme="minorHAnsi" w:cstheme="minorBidi"/>
+              <w:noProof/>
+              <w:color w:val="auto"/>
+              <w:sz w:val="24"/>
+            </w:rPr>
           </w:pPr>
-          <w:hyperlink w:anchor="_Toc25300">
-            <w:r>
+          <w:hyperlink w:anchor="_Toc244301962" w:history="1">
+            <w:r>
+              <w:rPr>
+                <w:rStyle w:val="Hyperlink"/>
+                <w:noProof/>
+              </w:rPr>
               <w:t>4.4 Error Handling, Logging &amp; Monitoring</w:t>
             </w:r>
             <w:r>
+              <w:rPr>
+                <w:noProof/>
+                <w:webHidden/>
+              </w:rPr>
               <w:tab/>
             </w:r>
             <w:r>
+              <w:rPr>
+                <w:noProof/>
+                <w:webHidden/>
+              </w:rPr>
               <w:fldChar w:fldCharType="begin"/>
             </w:r>
             <w:r>
-              <w:instrText>PAGEREF _Toc25300 \h</w:instrText>
-            </w:r>
-            <w:r>
+              <w:rPr>
+                <w:noProof/>
+                <w:webHidden/>
+              </w:rPr>
+              <w:instrText xml:space="preserve"> PAGEREF _Toc244301962 \h </w:instrText>
+            </w:r>
+            <w:r>
+              <w:rPr>
+                <w:noProof/>
+                <w:webHidden/>
+              </w:rPr>
+            </w:r>
+            <w:r>
+              <w:rPr>
+                <w:noProof/>
+                <w:webHidden/>
+              </w:rPr>
               <w:fldChar w:fldCharType="separate"/>
             </w:r>
             <w:r>
-              <w:t xml:space="preserve">8 </w:t>
-            </w:r>
-            <w:r>
+              <w:rPr>
+                <w:noProof/>
+                <w:webHidden/>
+              </w:rPr>
+              <w:t>9</w:t>
+            </w:r>
+            <w:r>
+              <w:rPr>
+                <w:noProof/>
+                <w:webHidden/>
+              </w:rPr>
               <w:fldChar w:fldCharType="end"/>
             </w:r>
           </w:hyperlink>
@@ -1835,29 +2784,69 @@
           <w:pPr>
             <w:pStyle w:val="TOC2"/>
             <w:tabs>
-              <w:tab w:val="right" w:leader="dot" w:pos="9895"/>
+              <w:tab w:val="right" w:leader="dot" w:pos="9885"/>
             </w:tabs>
+            <w:rPr>
+              <w:rFonts w:asciiTheme="minorHAnsi" w:eastAsiaTheme="minorEastAsia" w:hAnsiTheme="minorHAnsi" w:cstheme="minorBidi"/>
+              <w:noProof/>
+              <w:color w:val="auto"/>
+              <w:sz w:val="24"/>
+            </w:rPr>
           </w:pPr>
-          <w:hyperlink w:anchor="_Toc25301">
-            <w:r>
+          <w:hyperlink w:anchor="_Toc244301963" w:history="1">
+            <w:r>
+              <w:rPr>
+                <w:rStyle w:val="Hyperlink"/>
+                <w:noProof/>
+              </w:rPr>
               <w:t>4.5 UX Design</w:t>
             </w:r>
             <w:r>
+              <w:rPr>
+                <w:noProof/>
+                <w:webHidden/>
+              </w:rPr>
               <w:tab/>
             </w:r>
             <w:r>
+              <w:rPr>
+                <w:noProof/>
+                <w:webHidden/>
+              </w:rPr>
               <w:fldChar w:fldCharType="begin"/>
             </w:r>
             <w:r>
-              <w:instrText>PAGEREF _Toc25301 \h</w:instrText>
-            </w:r>
-            <w:r>
+              <w:rPr>
+                <w:noProof/>
+                <w:webHidden/>
+              </w:rPr>
+              <w:instrText xml:space="preserve"> PAGEREF _Toc244301963 \h </w:instrText>
+            </w:r>
+            <w:r>
+              <w:rPr>
+                <w:noProof/>
+                <w:webHidden/>
+              </w:rPr>
+            </w:r>
+            <w:r>
+              <w:rPr>
+                <w:noProof/>
+                <w:webHidden/>
+              </w:rPr>
               <w:fldChar w:fldCharType="separate"/>
             </w:r>
             <w:r>
-              <w:t xml:space="preserve">9 </w:t>
-            </w:r>
-            <w:r>
+              <w:rPr>
+                <w:noProof/>
+                <w:webHidden/>
+              </w:rPr>
+              <w:t>9</w:t>
+            </w:r>
+            <w:r>
+              <w:rPr>
+                <w:noProof/>
+                <w:webHidden/>
+              </w:rPr>
               <w:fldChar w:fldCharType="end"/>
             </w:r>
           </w:hyperlink>
@@ -1866,29 +2855,69 @@
           <w:pPr>
             <w:pStyle w:val="TOC2"/>
             <w:tabs>
-              <w:tab w:val="right" w:leader="dot" w:pos="9895"/>
+              <w:tab w:val="right" w:leader="dot" w:pos="9885"/>
             </w:tabs>
+            <w:rPr>
+              <w:rFonts w:asciiTheme="minorHAnsi" w:eastAsiaTheme="minorEastAsia" w:hAnsiTheme="minorHAnsi" w:cstheme="minorBidi"/>
+              <w:noProof/>
+              <w:color w:val="auto"/>
+              <w:sz w:val="24"/>
+            </w:rPr>
           </w:pPr>
-          <w:hyperlink w:anchor="_Toc25302">
-            <w:r>
+          <w:hyperlink w:anchor="_Toc244301964" w:history="1">
+            <w:r>
+              <w:rPr>
+                <w:rStyle w:val="Hyperlink"/>
+                <w:noProof/>
+              </w:rPr>
               <w:t>4.6 Open Issues &amp; Next Steps</w:t>
             </w:r>
             <w:r>
+              <w:rPr>
+                <w:noProof/>
+                <w:webHidden/>
+              </w:rPr>
               <w:tab/>
             </w:r>
             <w:r>
+              <w:rPr>
+                <w:noProof/>
+                <w:webHidden/>
+              </w:rPr>
               <w:fldChar w:fldCharType="begin"/>
             </w:r>
             <w:r>
-              <w:instrText>PAGEREF _Toc25302 \h</w:instrText>
-            </w:r>
-            <w:r>
+              <w:rPr>
+                <w:noProof/>
+                <w:webHidden/>
+              </w:rPr>
+              <w:instrText xml:space="preserve"> PAGEREF _Toc244301964 \h </w:instrText>
+            </w:r>
+            <w:r>
+              <w:rPr>
+                <w:noProof/>
+                <w:webHidden/>
+              </w:rPr>
+            </w:r>
+            <w:r>
+              <w:rPr>
+                <w:noProof/>
+                <w:webHidden/>
+              </w:rPr>
               <w:fldChar w:fldCharType="separate"/>
             </w:r>
             <w:r>
-              <w:t xml:space="preserve">9 </w:t>
-            </w:r>
-            <w:r>
+              <w:rPr>
+                <w:noProof/>
+                <w:webHidden/>
+              </w:rPr>
+              <w:t>10</w:t>
+            </w:r>
+            <w:r>
+              <w:rPr>
+                <w:noProof/>
+                <w:webHidden/>
+              </w:rPr>
               <w:fldChar w:fldCharType="end"/>
             </w:r>
           </w:hyperlink>
@@ -1897,29 +2926,69 @@
           <w:pPr>
             <w:pStyle w:val="TOC1"/>
             <w:tabs>
-              <w:tab w:val="right" w:leader="dot" w:pos="9895"/>
+              <w:tab w:val="right" w:leader="dot" w:pos="9885"/>
             </w:tabs>
+            <w:rPr>
+              <w:rFonts w:asciiTheme="minorHAnsi" w:eastAsiaTheme="minorEastAsia" w:hAnsiTheme="minorHAnsi" w:cstheme="minorBidi"/>
+              <w:noProof/>
+              <w:color w:val="auto"/>
+              <w:sz w:val="24"/>
+            </w:rPr>
           </w:pPr>
-          <w:hyperlink w:anchor="_Toc25303">
-            <w:r>
+          <w:hyperlink w:anchor="_Toc244301965" w:history="1">
+            <w:r>
+              <w:rPr>
+                <w:rStyle w:val="Hyperlink"/>
+                <w:noProof/>
+              </w:rPr>
               <w:t>5. Appendices</w:t>
             </w:r>
             <w:r>
+              <w:rPr>
+                <w:noProof/>
+                <w:webHidden/>
+              </w:rPr>
               <w:tab/>
             </w:r>
             <w:r>
+              <w:rPr>
+                <w:noProof/>
+                <w:webHidden/>
+              </w:rPr>
               <w:fldChar w:fldCharType="begin"/>
             </w:r>
             <w:r>
-              <w:instrText>PAGEREF _Toc25303 \h</w:instrText>
-            </w:r>
-            <w:r>
+              <w:rPr>
+                <w:noProof/>
+                <w:webHidden/>
+              </w:rPr>
+              <w:instrText xml:space="preserve"> PAGEREF _Toc244301965 \h </w:instrText>
+            </w:r>
+            <w:r>
+              <w:rPr>
+                <w:noProof/>
+                <w:webHidden/>
+              </w:rPr>
+            </w:r>
+            <w:r>
+              <w:rPr>
+                <w:noProof/>
+                <w:webHidden/>
+              </w:rPr>
               <w:fldChar w:fldCharType="separate"/>
             </w:r>
             <w:r>
-              <w:t xml:space="preserve">10 </w:t>
-            </w:r>
-            <w:r>
+              <w:rPr>
+                <w:noProof/>
+                <w:webHidden/>
+              </w:rPr>
+              <w:t>10</w:t>
+            </w:r>
+            <w:r>
+              <w:rPr>
+                <w:noProof/>
+                <w:webHidden/>
+              </w:rPr>
               <w:fldChar w:fldCharType="end"/>
             </w:r>
           </w:hyperlink>
@@ -1928,29 +2997,69 @@
           <w:pPr>
             <w:pStyle w:val="TOC2"/>
             <w:tabs>
-              <w:tab w:val="right" w:leader="dot" w:pos="9895"/>
+              <w:tab w:val="right" w:leader="dot" w:pos="9885"/>
             </w:tabs>
+            <w:rPr>
+              <w:rFonts w:asciiTheme="minorHAnsi" w:eastAsiaTheme="minorEastAsia" w:hAnsiTheme="minorHAnsi" w:cstheme="minorBidi"/>
+              <w:noProof/>
+              <w:color w:val="auto"/>
+              <w:sz w:val="24"/>
+            </w:rPr>
           </w:pPr>
-          <w:hyperlink w:anchor="_Toc25304">
-            <w:r>
+          <w:hyperlink w:anchor="_Toc244301966" w:history="1">
+            <w:r>
+              <w:rPr>
+                <w:rStyle w:val="Hyperlink"/>
+                <w:noProof/>
+              </w:rPr>
               <w:t>5.1 Glossary</w:t>
             </w:r>
             <w:r>
+              <w:rPr>
+                <w:noProof/>
+                <w:webHidden/>
+              </w:rPr>
               <w:tab/>
             </w:r>
             <w:r>
+              <w:rPr>
+                <w:noProof/>
+                <w:webHidden/>
+              </w:rPr>
               <w:fldChar w:fldCharType="begin"/>
             </w:r>
             <w:r>
-              <w:instrText>PAGEREF _Toc25304 \h</w:instrText>
-            </w:r>
-            <w:r>
+              <w:rPr>
+                <w:noProof/>
+                <w:webHidden/>
+              </w:rPr>
+              <w:instrText xml:space="preserve"> PAGEREF _Toc244301966 \h </w:instrText>
+            </w:r>
+            <w:r>
+              <w:rPr>
+                <w:noProof/>
+                <w:webHidden/>
+              </w:rPr>
+            </w:r>
+            <w:r>
+              <w:rPr>
+                <w:noProof/>
+                <w:webHidden/>
+              </w:rPr>
               <w:fldChar w:fldCharType="separate"/>
             </w:r>
             <w:r>
-              <w:t xml:space="preserve">10 </w:t>
-            </w:r>
-            <w:r>
+              <w:rPr>
+                <w:noProof/>
+                <w:webHidden/>
+              </w:rPr>
+              <w:t>10</w:t>
+            </w:r>
+            <w:r>
+              <w:rPr>
+                <w:noProof/>
+                <w:webHidden/>
+              </w:rPr>
               <w:fldChar w:fldCharType="end"/>
             </w:r>
           </w:hyperlink>
@@ -1959,29 +3068,69 @@
           <w:pPr>
             <w:pStyle w:val="TOC2"/>
             <w:tabs>
-              <w:tab w:val="right" w:leader="dot" w:pos="9895"/>
+              <w:tab w:val="right" w:leader="dot" w:pos="9885"/>
             </w:tabs>
+            <w:rPr>
+              <w:rFonts w:asciiTheme="minorHAnsi" w:eastAsiaTheme="minorEastAsia" w:hAnsiTheme="minorHAnsi" w:cstheme="minorBidi"/>
+              <w:noProof/>
+              <w:color w:val="auto"/>
+              <w:sz w:val="24"/>
+            </w:rPr>
           </w:pPr>
-          <w:hyperlink w:anchor="_Toc25305">
-            <w:r>
+          <w:hyperlink w:anchor="_Toc244301967" w:history="1">
+            <w:r>
+              <w:rPr>
+                <w:rStyle w:val="Hyperlink"/>
+                <w:noProof/>
+              </w:rPr>
               <w:t>5.2 References</w:t>
             </w:r>
             <w:r>
+              <w:rPr>
+                <w:noProof/>
+                <w:webHidden/>
+              </w:rPr>
               <w:tab/>
             </w:r>
             <w:r>
+              <w:rPr>
+                <w:noProof/>
+                <w:webHidden/>
+              </w:rPr>
               <w:fldChar w:fldCharType="begin"/>
             </w:r>
             <w:r>
-              <w:instrText>PAGEREF _Toc25305 \h</w:instrText>
-            </w:r>
-            <w:r>
+              <w:rPr>
+                <w:noProof/>
+                <w:webHidden/>
+              </w:rPr>
+              <w:instrText xml:space="preserve"> PAGEREF _Toc244301967 \h </w:instrText>
+            </w:r>
+            <w:r>
+              <w:rPr>
+                <w:noProof/>
+                <w:webHidden/>
+              </w:rPr>
+            </w:r>
+            <w:r>
+              <w:rPr>
+                <w:noProof/>
+                <w:webHidden/>
+              </w:rPr>
               <w:fldChar w:fldCharType="separate"/>
             </w:r>
             <w:r>
-              <w:t xml:space="preserve">10 </w:t>
-            </w:r>
-            <w:r>
+              <w:rPr>
+                <w:noProof/>
+                <w:webHidden/>
+              </w:rPr>
+              <w:t>10</w:t>
+            </w:r>
+            <w:r>
+              <w:rPr>
+                <w:noProof/>
+                <w:webHidden/>
+              </w:rPr>
               <w:fldChar w:fldCharType="end"/>
             </w:r>
           </w:hyperlink>
@@ -2212,11 +3361,14 @@
         <w:pStyle w:val="Heading1"/>
         <w:ind w:left="-5"/>
       </w:pPr>
-      <w:bookmarkStart w:id="0" w:name="_Toc25282"/>
-      <w:r>
-        <w:t xml:space="preserve">2. Document Overview </w:t>
+      <w:bookmarkStart w:id="0" w:name="_Toc244301944"/>
+      <w:r>
+        <w:t>2. Document Overview</w:t>
       </w:r>
       <w:bookmarkEnd w:id="0"/>
+      <w:r>
+        <w:t xml:space="preserve"> </w:t>
+      </w:r>
     </w:p>
     <w:p>
       <w:pPr>
@@ -2249,11 +3401,14 @@
         <w:pStyle w:val="Heading2"/>
         <w:ind w:left="-5"/>
       </w:pPr>
-      <w:bookmarkStart w:id="1" w:name="_Toc25283"/>
-      <w:r>
-        <w:t xml:space="preserve">2.2 Related Documents </w:t>
+      <w:bookmarkStart w:id="1" w:name="_Toc244301945"/>
+      <w:r>
+        <w:t>2.2 Related Documents</w:t>
       </w:r>
       <w:bookmarkEnd w:id="1"/>
+      <w:r>
+        <w:t xml:space="preserve"> </w:t>
+      </w:r>
     </w:p>
     <w:tbl>
       <w:tblPr>
@@ -2352,13 +3507,7 @@
               <w:rPr>
                 <w:sz w:val="17"/>
               </w:rPr>
-              <w:t>Software Requirements Specification (SRS), Version 1.0</w:t>
-            </w:r>
-            <w:r>
-              <w:rPr>
-                <w:sz w:val="20"/>
-              </w:rPr>
-              <w:t xml:space="preserve"> </w:t>
+              <w:t>Software Requirements Specification (SRS), Version 1.3</w:t>
             </w:r>
           </w:p>
         </w:tc>
@@ -2380,13 +3529,7 @@
               <w:rPr>
                 <w:sz w:val="17"/>
               </w:rPr>
-              <w:t>Defines functional/non-functional requirements, analysis models, field layouts and traceability.</w:t>
-            </w:r>
-            <w:r>
-              <w:rPr>
-                <w:sz w:val="20"/>
-              </w:rPr>
-              <w:t xml:space="preserve"> </w:t>
+              <w:t>Defines functional/non-functional requirements, analysis models, field layouts and traceability; revised 31-Oct-2026.</w:t>
             </w:r>
           </w:p>
         </w:tc>
@@ -2526,22 +3669,28 @@
         <w:pStyle w:val="Heading1"/>
         <w:ind w:left="-5"/>
       </w:pPr>
-      <w:bookmarkStart w:id="2" w:name="_Toc25284"/>
-      <w:r>
-        <w:t xml:space="preserve">3. Architecture </w:t>
+      <w:bookmarkStart w:id="2" w:name="_Toc244301946"/>
+      <w:r>
+        <w:t>3. Architecture</w:t>
       </w:r>
       <w:bookmarkEnd w:id="2"/>
+      <w:r>
+        <w:t xml:space="preserve"> </w:t>
+      </w:r>
     </w:p>
     <w:p>
       <w:pPr>
         <w:pStyle w:val="Heading2"/>
         <w:ind w:left="-5"/>
       </w:pPr>
-      <w:bookmarkStart w:id="3" w:name="_Toc25285"/>
-      <w:r>
-        <w:t xml:space="preserve">3.1 Architecture Goals and Constraints </w:t>
+      <w:bookmarkStart w:id="3" w:name="_Toc244301947"/>
+      <w:r>
+        <w:t>3.1 Architecture Goals and Constraints</w:t>
       </w:r>
       <w:bookmarkEnd w:id="3"/>
+      <w:r>
+        <w:t xml:space="preserve"> </w:t>
+      </w:r>
     </w:p>
     <w:p>
       <w:pPr>
@@ -2752,11 +3901,14 @@
         <w:pStyle w:val="Heading2"/>
         <w:ind w:left="-5"/>
       </w:pPr>
-      <w:bookmarkStart w:id="4" w:name="_Toc25286"/>
-      <w:r>
-        <w:t xml:space="preserve">3.2 Stakeholders and Concerns </w:t>
+      <w:bookmarkStart w:id="4" w:name="_Toc244301948"/>
+      <w:r>
+        <w:t>3.2 Stakeholders and Concerns</w:t>
       </w:r>
       <w:bookmarkEnd w:id="4"/>
+      <w:r>
+        <w:t xml:space="preserve"> </w:t>
+      </w:r>
     </w:p>
     <w:tbl>
       <w:tblPr>
@@ -3202,11 +4354,14 @@
         <w:pStyle w:val="Heading2"/>
         <w:ind w:left="-5"/>
       </w:pPr>
-      <w:bookmarkStart w:id="5" w:name="_Toc25287"/>
-      <w:r>
-        <w:t xml:space="preserve">3.3 Component Diagram </w:t>
+      <w:bookmarkStart w:id="5" w:name="_Toc244301949"/>
+      <w:r>
+        <w:t>3.3 Component Diagram</w:t>
       </w:r>
       <w:bookmarkEnd w:id="5"/>
+      <w:r>
+        <w:t xml:space="preserve"> </w:t>
+      </w:r>
     </w:p>
     <w:p>
       <w:pPr>
@@ -3309,11 +4464,14 @@
         <w:pStyle w:val="Heading2"/>
         <w:ind w:left="-5"/>
       </w:pPr>
-      <w:bookmarkStart w:id="6" w:name="_Toc25288"/>
-      <w:r>
-        <w:t xml:space="preserve">3.4 Component Descriptions </w:t>
+      <w:bookmarkStart w:id="6" w:name="_Toc244301950"/>
+      <w:r>
+        <w:t>3.4 Component Descriptions</w:t>
       </w:r>
       <w:bookmarkEnd w:id="6"/>
+      <w:r>
+        <w:t xml:space="preserve"> </w:t>
+      </w:r>
     </w:p>
     <w:tbl>
       <w:tblPr>
@@ -3988,13 +5146,7 @@
               <w:rPr>
                 <w:sz w:val="15"/>
               </w:rPr>
-              <w:t>Manages users, roles, permissions and system configuration.</w:t>
-            </w:r>
-            <w:r>
-              <w:rPr>
-                <w:sz w:val="20"/>
-              </w:rPr>
-              <w:t xml:space="preserve"> </w:t>
+              <w:t>Manages accounts and roles. Public registration creates Customer accounts only; Administrators use the User Management screen and protected API to create staff/admin accounts, assign roles, update accounts, reset passwords and deactivate/reactivate users.</w:t>
             </w:r>
           </w:p>
         </w:tc>
@@ -4047,6 +5199,7 @@
               <w:rPr>
                 <w:sz w:val="15"/>
               </w:rPr>
+              <w:lastRenderedPageBreak/>
               <w:t>Relational Database</w:t>
             </w:r>
             <w:r>
@@ -4132,12 +5285,14 @@
         <w:pStyle w:val="Heading2"/>
         <w:ind w:left="-5"/>
       </w:pPr>
-      <w:bookmarkStart w:id="7" w:name="_Toc25289"/>
-      <w:r>
-        <w:lastRenderedPageBreak/>
-        <w:t xml:space="preserve">3.5 Chosen Architecture Pattern and Rationale </w:t>
+      <w:bookmarkStart w:id="7" w:name="_Toc244301951"/>
+      <w:r>
+        <w:t>3.5 Chosen Architecture Pattern and Rationale</w:t>
       </w:r>
       <w:bookmarkEnd w:id="7"/>
+      <w:r>
+        <w:t xml:space="preserve"> </w:t>
+      </w:r>
     </w:p>
     <w:p>
       <w:pPr>
@@ -4492,11 +5647,14 @@
         <w:pStyle w:val="Heading2"/>
         <w:ind w:left="-5"/>
       </w:pPr>
-      <w:bookmarkStart w:id="8" w:name="_Toc25290"/>
-      <w:r>
-        <w:t xml:space="preserve">3.6 Technology Stack &amp; Data Stores </w:t>
+      <w:bookmarkStart w:id="8" w:name="_Toc244301952"/>
+      <w:r>
+        <w:t>3.6 Technology Stack &amp; Data Stores</w:t>
       </w:r>
       <w:bookmarkEnd w:id="8"/>
+      <w:r>
+        <w:t xml:space="preserve"> </w:t>
+      </w:r>
     </w:p>
     <w:tbl>
       <w:tblPr>
@@ -5174,11 +6332,14 @@
         <w:pStyle w:val="Heading2"/>
         <w:ind w:left="-5"/>
       </w:pPr>
-      <w:bookmarkStart w:id="9" w:name="_Toc25291"/>
-      <w:r>
-        <w:t xml:space="preserve">3.7 Risks &amp; Mitigations </w:t>
+      <w:bookmarkStart w:id="9" w:name="_Toc244301953"/>
+      <w:r>
+        <w:t>3.7 Risks &amp; Mitigations</w:t>
       </w:r>
       <w:bookmarkEnd w:id="9"/>
+      <w:r>
+        <w:t xml:space="preserve"> </w:t>
+      </w:r>
     </w:p>
     <w:tbl>
       <w:tblPr>
@@ -5880,11 +7041,15 @@
         <w:pStyle w:val="Heading2"/>
         <w:ind w:left="-5"/>
       </w:pPr>
-      <w:bookmarkStart w:id="10" w:name="_Toc25292"/>
-      <w:r>
-        <w:t xml:space="preserve">3.8 Traceability to Requirements </w:t>
+      <w:bookmarkStart w:id="10" w:name="_Toc244301954"/>
+      <w:r>
+        <w:lastRenderedPageBreak/>
+        <w:t>3.8 Traceability to Requirements</w:t>
       </w:r>
       <w:bookmarkEnd w:id="10"/>
+      <w:r>
+        <w:t xml:space="preserve"> </w:t>
+      </w:r>
     </w:p>
     <w:tbl>
       <w:tblPr>
@@ -6185,7 +7350,6 @@
               <w:rPr>
                 <w:sz w:val="16"/>
               </w:rPr>
-              <w:lastRenderedPageBreak/>
               <w:t>FR-003</w:t>
             </w:r>
             <w:r>
@@ -6712,11 +7876,14 @@
         <w:pStyle w:val="Heading2"/>
         <w:ind w:left="-5"/>
       </w:pPr>
-      <w:bookmarkStart w:id="11" w:name="_Toc25293"/>
-      <w:r>
-        <w:t xml:space="preserve">3.9 Security Architecture </w:t>
+      <w:bookmarkStart w:id="11" w:name="_Toc244301955"/>
+      <w:r>
+        <w:t>3.9 Security Architecture</w:t>
       </w:r>
       <w:bookmarkEnd w:id="11"/>
+      <w:r>
+        <w:t xml:space="preserve"> </w:t>
+      </w:r>
     </w:p>
     <w:tbl>
       <w:tblPr>
@@ -6842,13 +8009,7 @@
               <w:rPr>
                 <w:sz w:val="16"/>
               </w:rPr>
-              <w:t>Users authenticate before protected functions are accessed.</w:t>
-            </w:r>
-            <w:r>
-              <w:rPr>
-                <w:sz w:val="20"/>
-              </w:rPr>
-              <w:t xml:space="preserve"> </w:t>
+              <w:t>Staff sign in through the login endpoint. Public registration creates a Customer role only and offers no role selector; registration and login return bearer tokens for authenticated API calls.</w:t>
             </w:r>
           </w:p>
         </w:tc>
@@ -6901,13 +8062,7 @@
               <w:rPr>
                 <w:sz w:val="16"/>
               </w:rPr>
-              <w:t>Permissions are based on Customer, Service Advisor, Service Technician or Administrator role.</w:t>
-            </w:r>
-            <w:r>
-              <w:rPr>
-                <w:sz w:val="20"/>
-              </w:rPr>
-              <w:t xml:space="preserve"> </w:t>
+              <w:t>Permissions are based on Customer, Service Advisor, Service Technician or Administrator. Public registration cannot grant a staff/Admin role.</w:t>
             </w:r>
           </w:p>
         </w:tc>
@@ -7075,13 +8230,7 @@
               <w:rPr>
                 <w:sz w:val="16"/>
               </w:rPr>
-              <w:t>Passwords are stored only as salted hashes using bcrypt or Argon2.</w:t>
-            </w:r>
-            <w:r>
-              <w:rPr>
-                <w:sz w:val="20"/>
-              </w:rPr>
-              <w:t xml:space="preserve"> </w:t>
+              <w:t>Passwords are hashed with bcrypt (cost factor 12); plaintext passwords are not stored.</w:t>
             </w:r>
           </w:p>
         </w:tc>
@@ -7133,13 +8282,7 @@
               <w:rPr>
                 <w:sz w:val="16"/>
               </w:rPr>
-              <w:t>Status changes and record edits are timestamped and attributed to the acting user.</w:t>
-            </w:r>
-            <w:r>
-              <w:rPr>
-                <w:sz w:val="20"/>
-              </w:rPr>
-              <w:t xml:space="preserve"> </w:t>
+              <w:t>Customer self-registration, successful authentication, administrative account changes, status changes and record edits are recorded with actor/target details and timestamps where applicable.</w:t>
             </w:r>
           </w:p>
         </w:tc>
@@ -7202,6 +8345,52 @@
           </w:p>
         </w:tc>
       </w:tr>
+      <w:tr>
+        <w:trPr>
+          <w:trHeight w:val="206"/>
+        </w:trPr>
+        <w:tc>
+          <w:tcPr>
+            <w:tcW w:w="4968" w:type="dxa"/>
+            <w:tcBorders>
+              <w:top w:val="single" w:sz="4" w:space="0" w:color="000000"/>
+              <w:left w:val="single" w:sz="4" w:space="0" w:color="000000"/>
+              <w:bottom w:val="single" w:sz="4" w:space="0" w:color="000000"/>
+              <w:right w:val="single" w:sz="4" w:space="0" w:color="000000"/>
+            </w:tcBorders>
+          </w:tcPr>
+          <w:p>
+            <w:r>
+              <w:rPr>
+                <w:sz w:val="16"/>
+              </w:rPr>
+              <w:t>Customer profile linking</w:t>
+            </w:r>
+          </w:p>
+        </w:tc>
+        <w:tc>
+          <w:tcPr>
+            <w:tcW w:w="4968" w:type="dxa"/>
+            <w:tcBorders>
+              <w:top w:val="single" w:sz="4" w:space="0" w:color="000000"/>
+              <w:left w:val="single" w:sz="4" w:space="0" w:color="000000"/>
+              <w:bottom w:val="single" w:sz="4" w:space="0" w:color="000000"/>
+              <w:right w:val="single" w:sz="4" w:space="0" w:color="000000"/>
+            </w:tcBorders>
+          </w:tcPr>
+          <w:p>
+            <w:pPr>
+              <w:ind w:left="1"/>
+            </w:pPr>
+            <w:r>
+              <w:rPr>
+                <w:sz w:val="16"/>
+              </w:rPr>
+              <w:t>Within a database transaction, link only an unlinked customer record whose email and normalized name match; reject mismatches/already-linked records; otherwise create a new profile. The submitted phone is not part of the current match rule.</w:t>
+            </w:r>
+          </w:p>
+        </w:tc>
+      </w:tr>
     </w:tbl>
     <w:p>
       <w:pPr>
@@ -7219,22 +8408,28 @@
         <w:pStyle w:val="Heading1"/>
         <w:ind w:left="-5"/>
       </w:pPr>
-      <w:bookmarkStart w:id="12" w:name="_Toc25294"/>
-      <w:r>
-        <w:t xml:space="preserve">4. Design </w:t>
+      <w:bookmarkStart w:id="12" w:name="_Toc244301956"/>
+      <w:r>
+        <w:t>4. Design</w:t>
       </w:r>
       <w:bookmarkEnd w:id="12"/>
+      <w:r>
+        <w:t xml:space="preserve"> </w:t>
+      </w:r>
     </w:p>
     <w:p>
       <w:pPr>
         <w:pStyle w:val="Heading2"/>
         <w:ind w:left="-5"/>
       </w:pPr>
-      <w:bookmarkStart w:id="13" w:name="_Toc25295"/>
-      <w:r>
-        <w:t xml:space="preserve">4.1 Design Overview </w:t>
+      <w:bookmarkStart w:id="13" w:name="_Toc244301957"/>
+      <w:r>
+        <w:t>4.1 Design Overview</w:t>
       </w:r>
       <w:bookmarkEnd w:id="13"/>
+      <w:r>
+        <w:t xml:space="preserve"> </w:t>
+      </w:r>
     </w:p>
     <w:p>
       <w:pPr>
@@ -7334,22 +8529,28 @@
         <w:spacing w:after="167"/>
         <w:ind w:left="-5"/>
       </w:pPr>
-      <w:bookmarkStart w:id="14" w:name="_Toc25296"/>
-      <w:r>
-        <w:t xml:space="preserve">4.2 UML Sequence Diagrams </w:t>
+      <w:bookmarkStart w:id="14" w:name="_Toc244301958"/>
+      <w:r>
+        <w:t>4.2 UML Sequence Diagrams</w:t>
       </w:r>
       <w:bookmarkEnd w:id="14"/>
+      <w:r>
+        <w:t xml:space="preserve"> </w:t>
+      </w:r>
     </w:p>
     <w:p>
       <w:pPr>
         <w:pStyle w:val="Heading3"/>
         <w:ind w:left="-5"/>
       </w:pPr>
-      <w:bookmarkStart w:id="15" w:name="_Toc25297"/>
-      <w:r>
-        <w:t xml:space="preserve">4.2.1 Create, Review and Validate Service Request </w:t>
+      <w:bookmarkStart w:id="15" w:name="_Toc244301959"/>
+      <w:r>
+        <w:t>4.2.1 Create, Review and Validate Service Request</w:t>
       </w:r>
       <w:bookmarkEnd w:id="15"/>
+      <w:r>
+        <w:t xml:space="preserve"> </w:t>
+      </w:r>
     </w:p>
     <w:p>
       <w:pPr>
@@ -7438,11 +8639,14 @@
         <w:pStyle w:val="Heading3"/>
         <w:ind w:left="-5"/>
       </w:pPr>
-      <w:bookmarkStart w:id="16" w:name="_Toc25298"/>
-      <w:r>
-        <w:t xml:space="preserve">4.2.2 Assign Work, Perform Service and Complete Request </w:t>
+      <w:bookmarkStart w:id="16" w:name="_Toc244301960"/>
+      <w:r>
+        <w:t>4.2.2 Assign Work, Perform Service and Complete Request</w:t>
       </w:r>
       <w:bookmarkEnd w:id="16"/>
+      <w:r>
+        <w:t xml:space="preserve"> </w:t>
+      </w:r>
     </w:p>
     <w:p>
       <w:pPr>
@@ -7530,12 +8734,15 @@
         <w:pStyle w:val="Heading2"/>
         <w:ind w:left="-5"/>
       </w:pPr>
-      <w:bookmarkStart w:id="17" w:name="_Toc25299"/>
+      <w:bookmarkStart w:id="17" w:name="_Toc244301961"/>
       <w:r>
         <w:lastRenderedPageBreak/>
-        <w:t xml:space="preserve">4.3 API Design </w:t>
+        <w:t>4.3 API Design</w:t>
       </w:r>
       <w:bookmarkEnd w:id="17"/>
+      <w:r>
+        <w:t xml:space="preserve"> </w:t>
+      </w:r>
     </w:p>
     <w:p>
       <w:pPr>
@@ -7546,7 +8753,7 @@
         <w:rPr>
           <w:sz w:val="20"/>
         </w:rPr>
-        <w:t xml:space="preserve">The SRS specifies a REST-style API using JSON. The following endpoint definitions are proposed for implementation; exact route naming may be finalized by the development team. </w:t>
+        <w:t>The system exposes a REST-style API using JSON. Implemented authentication and account-management endpoints are listed below; service-work endpoints remain design references where marked proposed.</w:t>
       </w:r>
     </w:p>
     <w:tbl>
@@ -8173,6 +9380,346 @@
           </w:p>
         </w:tc>
       </w:tr>
+      <w:tr>
+        <w:trPr>
+          <w:trHeight w:val="204"/>
+        </w:trPr>
+        <w:tc>
+          <w:tcPr>
+            <w:tcW w:w="3312" w:type="dxa"/>
+            <w:tcBorders>
+              <w:top w:val="single" w:sz="4" w:space="0" w:color="000000"/>
+              <w:left w:val="single" w:sz="4" w:space="0" w:color="000000"/>
+              <w:bottom w:val="single" w:sz="4" w:space="0" w:color="000000"/>
+              <w:right w:val="single" w:sz="4" w:space="0" w:color="000000"/>
+            </w:tcBorders>
+          </w:tcPr>
+          <w:p>
+            <w:r>
+              <w:rPr>
+                <w:sz w:val="16"/>
+              </w:rPr>
+              <w:t>POST</w:t>
+            </w:r>
+          </w:p>
+        </w:tc>
+        <w:tc>
+          <w:tcPr>
+            <w:tcW w:w="3312" w:type="dxa"/>
+            <w:tcBorders>
+              <w:top w:val="single" w:sz="4" w:space="0" w:color="000000"/>
+              <w:left w:val="single" w:sz="4" w:space="0" w:color="000000"/>
+              <w:bottom w:val="single" w:sz="4" w:space="0" w:color="000000"/>
+              <w:right w:val="single" w:sz="4" w:space="0" w:color="000000"/>
+            </w:tcBorders>
+          </w:tcPr>
+          <w:p>
+            <w:pPr>
+              <w:ind w:left="1"/>
+            </w:pPr>
+            <w:r>
+              <w:rPr>
+                <w:sz w:val="16"/>
+              </w:rPr>
+              <w:t>/api/auth/register</w:t>
+            </w:r>
+          </w:p>
+        </w:tc>
+        <w:tc>
+          <w:tcPr>
+            <w:tcW w:w="3311" w:type="dxa"/>
+            <w:tcBorders>
+              <w:top w:val="single" w:sz="4" w:space="0" w:color="000000"/>
+              <w:left w:val="single" w:sz="4" w:space="0" w:color="000000"/>
+              <w:bottom w:val="single" w:sz="4" w:space="0" w:color="000000"/>
+              <w:right w:val="single" w:sz="4" w:space="0" w:color="000000"/>
+            </w:tcBorders>
+          </w:tcPr>
+          <w:p>
+            <w:pPr>
+              <w:ind w:left="1"/>
+            </w:pPr>
+            <w:r>
+              <w:rPr>
+                <w:sz w:val="16"/>
+              </w:rPr>
+              <w:t>Public customer registration. Creates a Customer login and profile, or links an unlinked profile by matching email and normalized name; returns a bearer token. Phone is collected but is not used for profile matching.</w:t>
+            </w:r>
+          </w:p>
+        </w:tc>
+      </w:tr>
+      <w:tr>
+        <w:trPr>
+          <w:trHeight w:val="204"/>
+        </w:trPr>
+        <w:tc>
+          <w:tcPr>
+            <w:tcW w:w="3312" w:type="dxa"/>
+            <w:tcBorders>
+              <w:top w:val="single" w:sz="4" w:space="0" w:color="000000"/>
+              <w:left w:val="single" w:sz="4" w:space="0" w:color="000000"/>
+              <w:bottom w:val="single" w:sz="4" w:space="0" w:color="000000"/>
+              <w:right w:val="single" w:sz="4" w:space="0" w:color="000000"/>
+            </w:tcBorders>
+          </w:tcPr>
+          <w:p>
+            <w:r>
+              <w:rPr>
+                <w:sz w:val="16"/>
+              </w:rPr>
+              <w:t>POST</w:t>
+            </w:r>
+          </w:p>
+        </w:tc>
+        <w:tc>
+          <w:tcPr>
+            <w:tcW w:w="3312" w:type="dxa"/>
+            <w:tcBorders>
+              <w:top w:val="single" w:sz="4" w:space="0" w:color="000000"/>
+              <w:left w:val="single" w:sz="4" w:space="0" w:color="000000"/>
+              <w:bottom w:val="single" w:sz="4" w:space="0" w:color="000000"/>
+              <w:right w:val="single" w:sz="4" w:space="0" w:color="000000"/>
+            </w:tcBorders>
+          </w:tcPr>
+          <w:p>
+            <w:pPr>
+              <w:ind w:left="1"/>
+            </w:pPr>
+            <w:r>
+              <w:rPr>
+                <w:sz w:val="16"/>
+              </w:rPr>
+              <w:t>/api/auth/login</w:t>
+            </w:r>
+          </w:p>
+        </w:tc>
+        <w:tc>
+          <w:tcPr>
+            <w:tcW w:w="3311" w:type="dxa"/>
+            <w:tcBorders>
+              <w:top w:val="single" w:sz="4" w:space="0" w:color="000000"/>
+              <w:left w:val="single" w:sz="4" w:space="0" w:color="000000"/>
+              <w:bottom w:val="single" w:sz="4" w:space="0" w:color="000000"/>
+              <w:right w:val="single" w:sz="4" w:space="0" w:color="000000"/>
+            </w:tcBorders>
+          </w:tcPr>
+          <w:p>
+            <w:pPr>
+              <w:ind w:left="1"/>
+            </w:pPr>
+            <w:r>
+              <w:rPr>
+                <w:sz w:val="16"/>
+              </w:rPr>
+              <w:t>Authenticate an active account; returns a one-hour bearer token.</w:t>
+            </w:r>
+          </w:p>
+        </w:tc>
+      </w:tr>
+      <w:tr>
+        <w:trPr>
+          <w:trHeight w:val="204"/>
+        </w:trPr>
+        <w:tc>
+          <w:tcPr>
+            <w:tcW w:w="3312" w:type="dxa"/>
+            <w:tcBorders>
+              <w:top w:val="single" w:sz="4" w:space="0" w:color="000000"/>
+              <w:left w:val="single" w:sz="4" w:space="0" w:color="000000"/>
+              <w:bottom w:val="single" w:sz="4" w:space="0" w:color="000000"/>
+              <w:right w:val="single" w:sz="4" w:space="0" w:color="000000"/>
+            </w:tcBorders>
+          </w:tcPr>
+          <w:p>
+            <w:r>
+              <w:rPr>
+                <w:sz w:val="16"/>
+              </w:rPr>
+              <w:t>GET</w:t>
+            </w:r>
+          </w:p>
+        </w:tc>
+        <w:tc>
+          <w:tcPr>
+            <w:tcW w:w="3312" w:type="dxa"/>
+            <w:tcBorders>
+              <w:top w:val="single" w:sz="4" w:space="0" w:color="000000"/>
+              <w:left w:val="single" w:sz="4" w:space="0" w:color="000000"/>
+              <w:bottom w:val="single" w:sz="4" w:space="0" w:color="000000"/>
+              <w:right w:val="single" w:sz="4" w:space="0" w:color="000000"/>
+            </w:tcBorders>
+          </w:tcPr>
+          <w:p>
+            <w:pPr>
+              <w:ind w:left="1"/>
+            </w:pPr>
+            <w:r>
+              <w:rPr>
+                <w:sz w:val="16"/>
+              </w:rPr>
+              <w:t>/api/admin/users</w:t>
+            </w:r>
+          </w:p>
+        </w:tc>
+        <w:tc>
+          <w:tcPr>
+            <w:tcW w:w="3311" w:type="dxa"/>
+            <w:tcBorders>
+              <w:top w:val="single" w:sz="4" w:space="0" w:color="000000"/>
+              <w:left w:val="single" w:sz="4" w:space="0" w:color="000000"/>
+              <w:bottom w:val="single" w:sz="4" w:space="0" w:color="000000"/>
+              <w:right w:val="single" w:sz="4" w:space="0" w:color="000000"/>
+            </w:tcBorders>
+          </w:tcPr>
+          <w:p>
+            <w:pPr>
+              <w:ind w:left="1"/>
+            </w:pPr>
+            <w:r>
+              <w:rPr>
+                <w:sz w:val="16"/>
+              </w:rPr>
+              <w:t>Administrator-only paginated user listing.</w:t>
+            </w:r>
+          </w:p>
+        </w:tc>
+      </w:tr>
+      <w:tr>
+        <w:trPr>
+          <w:trHeight w:val="204"/>
+        </w:trPr>
+        <w:tc>
+          <w:tcPr>
+            <w:tcW w:w="3312" w:type="dxa"/>
+            <w:tcBorders>
+              <w:top w:val="single" w:sz="4" w:space="0" w:color="000000"/>
+              <w:left w:val="single" w:sz="4" w:space="0" w:color="000000"/>
+              <w:bottom w:val="single" w:sz="4" w:space="0" w:color="000000"/>
+              <w:right w:val="single" w:sz="4" w:space="0" w:color="000000"/>
+            </w:tcBorders>
+          </w:tcPr>
+          <w:p>
+            <w:r>
+              <w:rPr>
+                <w:sz w:val="16"/>
+              </w:rPr>
+              <w:t>POST</w:t>
+            </w:r>
+          </w:p>
+        </w:tc>
+        <w:tc>
+          <w:tcPr>
+            <w:tcW w:w="3312" w:type="dxa"/>
+            <w:tcBorders>
+              <w:top w:val="single" w:sz="4" w:space="0" w:color="000000"/>
+              <w:left w:val="single" w:sz="4" w:space="0" w:color="000000"/>
+              <w:bottom w:val="single" w:sz="4" w:space="0" w:color="000000"/>
+              <w:right w:val="single" w:sz="4" w:space="0" w:color="000000"/>
+            </w:tcBorders>
+          </w:tcPr>
+          <w:p>
+            <w:pPr>
+              <w:ind w:left="1"/>
+            </w:pPr>
+            <w:r>
+              <w:rPr>
+                <w:sz w:val="16"/>
+              </w:rPr>
+              <w:t>/api/admin/users</w:t>
+            </w:r>
+          </w:p>
+        </w:tc>
+        <w:tc>
+          <w:tcPr>
+            <w:tcW w:w="3311" w:type="dxa"/>
+            <w:tcBorders>
+              <w:top w:val="single" w:sz="4" w:space="0" w:color="000000"/>
+              <w:left w:val="single" w:sz="4" w:space="0" w:color="000000"/>
+              <w:bottom w:val="single" w:sz="4" w:space="0" w:color="000000"/>
+              <w:right w:val="single" w:sz="4" w:space="0" w:color="000000"/>
+            </w:tcBorders>
+          </w:tcPr>
+          <w:p>
+            <w:pPr>
+              <w:ind w:left="1"/>
+            </w:pPr>
+            <w:r>
+              <w:rPr>
+                <w:sz w:val="16"/>
+              </w:rPr>
+              <w:t>Administrator-only account creation with explicit role assignment.</w:t>
+            </w:r>
+          </w:p>
+        </w:tc>
+      </w:tr>
+      <w:tr>
+        <w:trPr>
+          <w:trHeight w:val="204"/>
+        </w:trPr>
+        <w:tc>
+          <w:tcPr>
+            <w:tcW w:w="3312" w:type="dxa"/>
+            <w:tcBorders>
+              <w:top w:val="single" w:sz="4" w:space="0" w:color="000000"/>
+              <w:left w:val="single" w:sz="4" w:space="0" w:color="000000"/>
+              <w:bottom w:val="single" w:sz="4" w:space="0" w:color="000000"/>
+              <w:right w:val="single" w:sz="4" w:space="0" w:color="000000"/>
+            </w:tcBorders>
+          </w:tcPr>
+          <w:p>
+            <w:r>
+              <w:rPr>
+                <w:sz w:val="16"/>
+              </w:rPr>
+              <w:t>PATCH</w:t>
+            </w:r>
+          </w:p>
+        </w:tc>
+        <w:tc>
+          <w:tcPr>
+            <w:tcW w:w="3312" w:type="dxa"/>
+            <w:tcBorders>
+              <w:top w:val="single" w:sz="4" w:space="0" w:color="000000"/>
+              <w:left w:val="single" w:sz="4" w:space="0" w:color="000000"/>
+              <w:bottom w:val="single" w:sz="4" w:space="0" w:color="000000"/>
+              <w:right w:val="single" w:sz="4" w:space="0" w:color="000000"/>
+            </w:tcBorders>
+          </w:tcPr>
+          <w:p>
+            <w:pPr>
+              <w:ind w:left="1"/>
+            </w:pPr>
+            <w:r>
+              <w:rPr>
+                <w:sz w:val="16"/>
+              </w:rPr>
+              <w:t>/api/admin/users/{id}</w:t>
+            </w:r>
+          </w:p>
+        </w:tc>
+        <w:tc>
+          <w:tcPr>
+            <w:tcW w:w="3311" w:type="dxa"/>
+            <w:tcBorders>
+              <w:top w:val="single" w:sz="4" w:space="0" w:color="000000"/>
+              <w:left w:val="single" w:sz="4" w:space="0" w:color="000000"/>
+              <w:bottom w:val="single" w:sz="4" w:space="0" w:color="000000"/>
+              <w:right w:val="single" w:sz="4" w:space="0" w:color="000000"/>
+            </w:tcBorders>
+          </w:tcPr>
+          <w:p>
+            <w:pPr>
+              <w:ind w:left="1"/>
+            </w:pPr>
+            <w:r>
+              <w:rPr>
+                <w:sz w:val="16"/>
+              </w:rPr>
+              <w:t>Administrator-only account update, role change, activation/deactivation or password reset.</w:t>
+            </w:r>
+          </w:p>
+        </w:tc>
+      </w:tr>
     </w:tbl>
     <w:p>
       <w:pPr>
@@ -8252,11 +9799,14 @@
         <w:pStyle w:val="Heading2"/>
         <w:ind w:left="-5"/>
       </w:pPr>
-      <w:bookmarkStart w:id="18" w:name="_Toc25300"/>
-      <w:r>
-        <w:t xml:space="preserve">4.4 Error Handling, Logging &amp; Monitoring </w:t>
+      <w:bookmarkStart w:id="18" w:name="_Toc244301962"/>
+      <w:r>
+        <w:t>4.4 Error Handling, Logging &amp; Monitoring</w:t>
       </w:r>
       <w:bookmarkEnd w:id="18"/>
+      <w:r>
+        <w:t xml:space="preserve"> </w:t>
+      </w:r>
     </w:p>
     <w:tbl>
       <w:tblPr>
@@ -8770,11 +10320,14 @@
         <w:pStyle w:val="Heading2"/>
         <w:ind w:left="-5"/>
       </w:pPr>
-      <w:bookmarkStart w:id="19" w:name="_Toc25301"/>
-      <w:r>
-        <w:t xml:space="preserve">4.5 UX Design </w:t>
+      <w:bookmarkStart w:id="19" w:name="_Toc244301963"/>
+      <w:r>
+        <w:t>4.5 UX Design</w:t>
       </w:r>
       <w:bookmarkEnd w:id="19"/>
+      <w:r>
+        <w:t xml:space="preserve"> </w:t>
+      </w:r>
     </w:p>
     <w:p>
       <w:pPr>
@@ -8943,13 +10496,7 @@
               <w:rPr>
                 <w:sz w:val="15"/>
               </w:rPr>
-              <w:t>All</w:t>
-            </w:r>
-            <w:r>
-              <w:rPr>
-                <w:sz w:val="20"/>
-              </w:rPr>
-              <w:t xml:space="preserve"> </w:t>
+              <w:t>Customer registration; all roles sign in</w:t>
             </w:r>
           </w:p>
         </w:tc>
@@ -8971,13 +10518,14 @@
               <w:rPr>
                 <w:sz w:val="15"/>
               </w:rPr>
-              <w:t>Authentication.</w:t>
-            </w:r>
-            <w:r>
-              <w:rPr>
-                <w:sz w:val="20"/>
-              </w:rPr>
-              <w:t xml:space="preserve"> </w:t>
+              <w:t xml:space="preserve">Public signup creates a Customer account only; signup links matching unlinked profile or creates a profile. Staff accounts are provisioned by an Administrator through the protected API; a </w:t>
+            </w:r>
+            <w:r>
+              <w:rPr>
+                <w:sz w:val="15"/>
+              </w:rPr>
+              <w:lastRenderedPageBreak/>
+              <w:t>browser user-management page is not implemented yet.</w:t>
             </w:r>
           </w:p>
         </w:tc>
@@ -9001,6 +10549,7 @@
               <w:rPr>
                 <w:sz w:val="15"/>
               </w:rPr>
+              <w:lastRenderedPageBreak/>
               <w:t>Customer &amp; Vehicle Registration</w:t>
             </w:r>
             <w:r>
@@ -9831,13 +11380,7 @@
               <w:rPr>
                 <w:sz w:val="15"/>
               </w:rPr>
-              <w:t>Manage users/roles/settings.</w:t>
-            </w:r>
-            <w:r>
-              <w:rPr>
-                <w:sz w:val="20"/>
-              </w:rPr>
-              <w:t xml:space="preserve"> </w:t>
+              <w:t>Administrator-only screen to create and manage staff roles, reset passwords and deactivate/reactivate accounts; Customer registration remains public and Customer-only.</w:t>
             </w:r>
           </w:p>
         </w:tc>
@@ -9859,11 +11402,14 @@
         <w:pStyle w:val="Heading2"/>
         <w:ind w:left="-5"/>
       </w:pPr>
-      <w:bookmarkStart w:id="20" w:name="_Toc25302"/>
-      <w:r>
-        <w:t xml:space="preserve">4.6 Open Issues &amp; Next Steps </w:t>
+      <w:bookmarkStart w:id="20" w:name="_Toc244301964"/>
+      <w:r>
+        <w:t>4.6 Open Issues &amp; Next Steps</w:t>
       </w:r>
       <w:bookmarkEnd w:id="20"/>
+      <w:r>
+        <w:t xml:space="preserve"> </w:t>
+      </w:r>
     </w:p>
     <w:p>
       <w:pPr>
@@ -9910,8 +11456,7 @@
         <w:rPr>
           <w:sz w:val="20"/>
         </w:rPr>
-        <w:lastRenderedPageBreak/>
-        <w:t xml:space="preserve">Complete final UI screen designs. </w:t>
+        <w:t>Validate the Administrator User Management screen and responsive layouts against the final UI requirements.</w:t>
       </w:r>
     </w:p>
     <w:p>
@@ -9951,22 +11496,28 @@
         <w:pStyle w:val="Heading1"/>
         <w:ind w:left="-5"/>
       </w:pPr>
-      <w:bookmarkStart w:id="21" w:name="_Toc25303"/>
-      <w:r>
-        <w:t xml:space="preserve">5. Appendices </w:t>
+      <w:bookmarkStart w:id="21" w:name="_Toc244301965"/>
+      <w:r>
+        <w:t>5. Appendices</w:t>
       </w:r>
       <w:bookmarkEnd w:id="21"/>
+      <w:r>
+        <w:t xml:space="preserve"> </w:t>
+      </w:r>
     </w:p>
     <w:p>
       <w:pPr>
         <w:pStyle w:val="Heading2"/>
         <w:ind w:left="-5"/>
       </w:pPr>
-      <w:bookmarkStart w:id="22" w:name="_Toc25304"/>
-      <w:r>
-        <w:t xml:space="preserve">5.1 Glossary </w:t>
+      <w:bookmarkStart w:id="22" w:name="_Toc244301966"/>
+      <w:r>
+        <w:t>5.1 Glossary</w:t>
       </w:r>
       <w:bookmarkEnd w:id="22"/>
+      <w:r>
+        <w:t xml:space="preserve"> </w:t>
+      </w:r>
     </w:p>
     <w:tbl>
       <w:tblPr>
@@ -10874,11 +12425,14 @@
         <w:pStyle w:val="Heading2"/>
         <w:ind w:left="-5"/>
       </w:pPr>
-      <w:bookmarkStart w:id="23" w:name="_Toc25305"/>
-      <w:r>
-        <w:t xml:space="preserve">5.2 References </w:t>
+      <w:bookmarkStart w:id="23" w:name="_Toc244301967"/>
+      <w:r>
+        <w:t>5.2 References</w:t>
       </w:r>
       <w:bookmarkEnd w:id="23"/>
+      <w:r>
+        <w:t xml:space="preserve"> </w:t>
+      </w:r>
     </w:p>
     <w:p>
       <w:pPr>
@@ -10893,7 +12447,7 @@
         <w:rPr>
           <w:sz w:val="20"/>
         </w:rPr>
-        <w:t xml:space="preserve">PES University, Department of Computer Science and Engineering, Software Requirements Specification for Vehicle Service &amp; Maintenance Management System, Version 1.0, 01-Oct-2026. </w:t>
+        <w:t>PES University, Department of Computer Science and Engineering, Software Requirements Specification for Vehicle Service &amp; Maintenance Management System, Version 1.3, revised 31-Oct-2026.</w:t>
       </w:r>
     </w:p>
     <w:p>
@@ -11019,6 +12573,7 @@
           <w:color w:val="4F81BD"/>
           <w:sz w:val="26"/>
         </w:rPr>
+        <w:lastRenderedPageBreak/>
         <w:t xml:space="preserve">5.3 Tools </w:t>
       </w:r>
     </w:p>
@@ -13266,6 +14821,7 @@
   <w:style w:type="character" w:default="1" w:styleId="DefaultParagraphFont">
     <w:name w:val="Default Paragraph Font"/>
     <w:uiPriority w:val="1"/>
+    <w:semiHidden/>
     <w:unhideWhenUsed/>
   </w:style>
   <w:style w:type="table" w:default="1" w:styleId="TableNormal">
@@ -13332,6 +14888,7 @@
   <w:style w:type="paragraph" w:styleId="TOC1">
     <w:name w:val="toc 1"/>
     <w:hidden/>
+    <w:uiPriority w:val="39"/>
     <w:pPr>
       <w:spacing w:after="33" w:line="259" w:lineRule="auto"/>
       <w:ind w:left="25" w:right="900" w:hanging="10"/>
@@ -13346,6 +14903,7 @@
   <w:style w:type="paragraph" w:styleId="TOC2">
     <w:name w:val="toc 2"/>
     <w:hidden/>
+    <w:uiPriority w:val="39"/>
     <w:pPr>
       <w:spacing w:after="33" w:line="259" w:lineRule="auto"/>
       <w:ind w:left="25" w:right="900" w:hanging="10"/>
@@ -13360,6 +14918,7 @@
   <w:style w:type="paragraph" w:styleId="TOC3">
     <w:name w:val="toc 3"/>
     <w:hidden/>
+    <w:uiPriority w:val="39"/>
     <w:pPr>
       <w:spacing w:after="33" w:line="259" w:lineRule="auto"/>
       <w:ind w:left="25" w:right="900" w:hanging="10"/>
@@ -13384,6 +14943,17 @@
         <w:right w:w="0" w:type="dxa"/>
       </w:tblCellMar>
     </w:tblPr>
+  </w:style>
+  <w:style w:type="character" w:styleId="Hyperlink">
+    <w:name w:val="Hyperlink"/>
+    <w:basedOn w:val="DefaultParagraphFont"/>
+    <w:uiPriority w:val="99"/>
+    <w:unhideWhenUsed/>
+    <w:rsid w:val="005B7210"/>
+    <w:rPr>
+      <w:color w:val="0563C1" w:themeColor="hyperlink"/>
+      <w:u w:val="single"/>
+    </w:rPr>
   </w:style>
 </w:styles>
 </file>

</xml_diff>